<commit_message>
docs(mosfets): add detailed static, dynamic switching, and fault waveforms across all working regions
</commit_message>
<xml_diff>
--- a/vvdn/mosfets/README.docx
+++ b/vvdn/mosfets/README.docx
@@ -3564,7 +3564,7 @@
           <w:color w:val="184C78"/>
           <w:sz w:val="28"/>
         </w:rPr>
-        <w:t>6. Power Loss Breakdown &amp; Thermal Sizing</w:t>
+        <w:t>6. Comprehensive Waveforms Across MOSFET Working Regions</w:t>
       </w:r>
     </w:p>
     <w:p>
@@ -3576,34 +3576,82 @@
           <w:color w:val="282C34"/>
           <w:sz w:val="21"/>
         </w:rPr>
-        <w:t>The total power dissipated by a MOSFET in a switching converter or power stage is given by:</w:t>
+        <w:t>Understanding how a MOSFET transitions through its physical conduction regions—both statically under DC bias and dynamically during microsecond/nanosecond switching transients—is paramount for power electronics, analog amplifier design, and failure avoidance.</w:t>
       </w:r>
     </w:p>
+    <w:tbl>
+      <w:tblPr>
+        <w:tblW w:type="auto" w:w="0"/>
+        <w:jc w:val="center"/>
+        <w:tblLook w:firstColumn="1" w:firstRow="1" w:lastColumn="0" w:lastRow="0" w:noHBand="0" w:noVBand="1" w:val="04A0"/>
+      </w:tblPr>
+      <w:tblGrid>
+        <w:gridCol w:w="9792"/>
+      </w:tblGrid>
+      <w:tr>
+        <w:tc>
+          <w:tcPr>
+            <w:tcW w:type="dxa" w:w="9792"/>
+            <w:shd w:fill="F5F6F8"/>
+            <w:tcMar>
+              <w:top w:w="80" w:type="dxa"/>
+              <w:bottom w:w="80" w:type="dxa"/>
+              <w:left w:w="140" w:type="dxa"/>
+              <w:right w:w="140" w:type="dxa"/>
+            </w:tcMar>
+            <w:tcBorders>
+              <w:left w:val="single" w:sz="18" w:space="0" w:color="CBD5E0"/>
+              <w:top w:val="none"/>
+              <w:right w:val="none"/>
+              <w:bottom w:val="none"/>
+            </w:tcBorders>
+          </w:tcPr>
+          <w:p>
+            <w:pPr>
+              <w:spacing w:line="240" w:lineRule="auto" w:after="0"/>
+            </w:pPr>
+            <w:r>
+              <w:rPr>
+                <w:rFonts w:ascii="Consolas" w:hAnsi="Consolas"/>
+                <w:color w:val="2D3748"/>
+                <w:sz w:val="18"/>
+              </w:rPr>
+              <w:t>┌───────────────────────────────────────────────────────────────────────────────────┐</w:t>
+              <w:br/>
+              <w:t>│                    Summary of MOSFET Operating Conduction Regimes                 │</w:t>
+              <w:br/>
+              <w:t>├─────────────────────┬──────────────────────────┬──────────────────────────────────┤</w:t>
+              <w:br/>
+              <w:t>│ Operating Region    │ Bias Condition           │ Conduction Mechanism             │</w:t>
+              <w:br/>
+              <w:t>├─────────────────────┼──────────────────────────┼──────────────────────────────────┤</w:t>
+              <w:br/>
+              <w:t>│ **1. Cutoff**       │ Vgs &lt; Vth                │ Subthreshold diffusion leakage   │</w:t>
+              <w:br/>
+              <w:t>│ **2. Linear/Triode**│ Vgs &gt; Vth, Vds &lt; Vgs-Vth │ Ohmic drift channel (Rds_on)     │</w:t>
+              <w:br/>
+              <w:t>│ **3. Pinch-Off**    │ Vds = Vgs - Vth          │ Drain inversion layer pinches off│</w:t>
+              <w:br/>
+              <w:t>│ **4. Saturation**   │ Vgs &gt; Vth, Vds &gt;= Vgs-Vth│ Constant-current pinch-off drift │</w:t>
+              <w:br/>
+              <w:t>│ **5. Avalanche**    │ Vds &gt;= V_BR(DSS)         │ Impact ionization breakdown      │</w:t>
+              <w:br/>
+              <w:t>│ **6. Quadrant III** │ Vds &lt; 0V (Reverse bias)  │ Body diode or reverse channel    │</w:t>
+              <w:br/>
+              <w:t>└─────────────────────┴──────────────────────────┴──────────────────────────────────┘</w:t>
+            </w:r>
+          </w:p>
+        </w:tc>
+      </w:tr>
+    </w:tbl>
+    <w:p/>
     <w:p>
       <w:pPr>
-        <w:spacing w:after="80"/>
-      </w:pPr>
-      <w:r>
-        <w:rPr>
-          <w:i/>
-          <w:color w:val="145AA0"/>
-          <w:sz w:val="21"/>
-        </w:rPr>
-      </w:r>
-      <w:r>
-        <w:rPr>
-          <w:color w:val="282C34"/>
-          <w:sz w:val="21"/>
-        </w:rPr>
-        <w:t>P_{TOTAL} = P_{COND} + P_{SW} + P_{GATE} + P_{COSS} + P_{DIODE}</w:t>
-      </w:r>
-      <w:r>
-        <w:rPr>
-          <w:i/>
-          <w:color w:val="145AA0"/>
-          <w:sz w:val="21"/>
-        </w:rPr>
-      </w:r>
+        <w:spacing w:before="80" w:after="80"/>
+        <w:pBdr>
+          <w:bottom w:val="single" w:sz="6" w:space="1" w:color="E2E8F0"/>
+        </w:pBdr>
+      </w:pPr>
     </w:p>
     <w:p>
       <w:pPr>
@@ -3615,7 +3663,7 @@
           <w:color w:val="4682B4"/>
           <w:sz w:val="24"/>
         </w:rPr>
-        <w:t>1. Conduction Loss (</w:t>
+        <w:t>6.1 Static Output Characteristics Waveform (</w:t>
       </w:r>
       <w:r>
         <w:rPr>
@@ -3624,7 +3672,7 @@
           <w:color w:val="145AA0"/>
           <w:sz w:val="24"/>
         </w:rPr>
-        <w:t>P_{COND</w:t>
+        <w:t>I_D</w:t>
       </w:r>
       <w:r>
         <w:rPr>
@@ -3632,167 +3680,7 @@
           <w:color w:val="4682B4"/>
           <w:sz w:val="24"/>
         </w:rPr>
-        <w:t>):</w:t>
-      </w:r>
-    </w:p>
-    <w:p>
-      <w:pPr>
-        <w:spacing w:after="80"/>
-      </w:pPr>
-      <w:r>
-        <w:rPr>
-          <w:i/>
-          <w:color w:val="145AA0"/>
-          <w:sz w:val="21"/>
-        </w:rPr>
-      </w:r>
-      <w:r>
-        <w:rPr>
-          <w:color w:val="282C34"/>
-          <w:sz w:val="21"/>
-        </w:rPr>
-        <w:t>P_{COND} = I_{D,rms}^2 \times R_{DS(on)}(T_j)</w:t>
-      </w:r>
-      <w:r>
-        <w:rPr>
-          <w:i/>
-          <w:color w:val="145AA0"/>
-          <w:sz w:val="21"/>
-        </w:rPr>
-      </w:r>
-    </w:p>
-    <w:p>
-      <w:pPr>
-        <w:spacing w:after="80"/>
-      </w:pPr>
-      <w:r>
-        <w:rPr>
-          <w:i/>
-          <w:color w:val="282C34"/>
-          <w:sz w:val="21"/>
-        </w:rPr>
-        <w:t>Caution</w:t>
-      </w:r>
-      <w:r>
-        <w:rPr>
-          <w:color w:val="282C34"/>
-          <w:sz w:val="21"/>
-        </w:rPr>
-        <w:t xml:space="preserve">: </w:t>
-      </w:r>
-      <w:r>
-        <w:rPr>
-          <w:i/>
-          <w:color w:val="145AA0"/>
-          <w:sz w:val="21"/>
-        </w:rPr>
-        <w:t>R_{DS(on)</w:t>
-      </w:r>
-      <w:r>
-        <w:rPr>
-          <w:color w:val="282C34"/>
-          <w:sz w:val="21"/>
-        </w:rPr>
-        <w:t xml:space="preserve"> has a strong positive temperature coefficient in Silicon (typically increasing by a factor of </w:t>
-      </w:r>
-      <w:r>
-        <w:rPr>
-          <w:i/>
-          <w:color w:val="145AA0"/>
-          <w:sz w:val="21"/>
-        </w:rPr>
-        <w:t>1.5×</w:t>
-      </w:r>
-      <w:r>
-        <w:rPr>
-          <w:color w:val="282C34"/>
-          <w:sz w:val="21"/>
-        </w:rPr>
-        <w:t xml:space="preserve"> to </w:t>
-      </w:r>
-      <w:r>
-        <w:rPr>
-          <w:i/>
-          <w:color w:val="145AA0"/>
-          <w:sz w:val="21"/>
-        </w:rPr>
-        <w:t>2.0×</w:t>
-      </w:r>
-      <w:r>
-        <w:rPr>
-          <w:color w:val="282C34"/>
-          <w:sz w:val="21"/>
-        </w:rPr>
-        <w:t xml:space="preserve"> between </w:t>
-      </w:r>
-      <w:r>
-        <w:rPr>
-          <w:i/>
-          <w:color w:val="145AA0"/>
-          <w:sz w:val="21"/>
-        </w:rPr>
-        <w:t>+25^\circC</w:t>
-      </w:r>
-      <w:r>
-        <w:rPr>
-          <w:color w:val="282C34"/>
-          <w:sz w:val="21"/>
-        </w:rPr>
-        <w:t xml:space="preserve"> and </w:t>
-      </w:r>
-      <w:r>
-        <w:rPr>
-          <w:i/>
-          <w:color w:val="145AA0"/>
-          <w:sz w:val="21"/>
-        </w:rPr>
-        <w:t>+150^\circC</w:t>
-      </w:r>
-      <w:r>
-        <w:rPr>
-          <w:color w:val="282C34"/>
-          <w:sz w:val="21"/>
-        </w:rPr>
-        <w:t>):</w:t>
-      </w:r>
-    </w:p>
-    <w:p>
-      <w:pPr>
-        <w:spacing w:after="80"/>
-      </w:pPr>
-      <w:r>
-        <w:rPr>
-          <w:i/>
-          <w:color w:val="145AA0"/>
-          <w:sz w:val="21"/>
-        </w:rPr>
-      </w:r>
-      <w:r>
-        <w:rPr>
-          <w:color w:val="282C34"/>
-          <w:sz w:val="21"/>
-        </w:rPr>
-        <w:t>R_{DS(on)}(T_j) = R_{DS(on)}(25^\circ\text{C}) \times \left(1 + \frac{\alpha}{100}(T_j - 25^\circ\text{C})\right) \quad (\alpha \approx 0.4\% \dots 0.7\% / ^\circ\text{C})</w:t>
-      </w:r>
-      <w:r>
-        <w:rPr>
-          <w:i/>
-          <w:color w:val="145AA0"/>
-          <w:sz w:val="21"/>
-        </w:rPr>
-      </w:r>
-    </w:p>
-    <w:p>
-      <w:pPr>
-        <w:spacing w:before="160" w:after="80"/>
-      </w:pPr>
-      <w:r>
-        <w:rPr>
-          <w:b/>
-          <w:color w:val="4682B4"/>
-          <w:sz w:val="24"/>
-        </w:rPr>
-        <w:t>2. Switching Losses (</w:t>
+        <w:t xml:space="preserve"> vs. </w:t>
       </w:r>
       <w:r>
         <w:rPr>
@@ -3801,7 +3689,7 @@
           <w:color w:val="145AA0"/>
           <w:sz w:val="24"/>
         </w:rPr>
-        <w:t>P_{SW</w:t>
+        <w:t>V_{DS</w:t>
       </w:r>
       <w:r>
         <w:rPr>
@@ -3809,7 +3697,7 @@
           <w:color w:val="4682B4"/>
           <w:sz w:val="24"/>
         </w:rPr>
-        <w:t>):</w:t>
+        <w:t>)</w:t>
       </w:r>
     </w:p>
     <w:p>
@@ -3821,7 +3709,7 @@
           <w:color w:val="282C34"/>
           <w:sz w:val="21"/>
         </w:rPr>
-        <w:t xml:space="preserve">During each turn-on and turn-off transition, </w:t>
+        <w:t>The family of output characteristic curves illustrates the static operating states across varying gate overdrive voltages (</w:t>
       </w:r>
       <w:r>
         <w:rPr>
@@ -3829,14 +3717,175 @@
           <w:color w:val="145AA0"/>
           <w:sz w:val="21"/>
         </w:rPr>
-        <w:t>V_{DS</w:t>
-      </w:r>
-      <w:r>
-        <w:rPr>
-          <w:color w:val="282C34"/>
-          <w:sz w:val="21"/>
-        </w:rPr>
-        <w:t xml:space="preserve"> and </w:t>
+        <w:t>V_{GS</w:t>
+      </w:r>
+      <w:r>
+        <w:rPr>
+          <w:color w:val="282C34"/>
+          <w:sz w:val="21"/>
+        </w:rPr>
+        <w:t>):</w:t>
+      </w:r>
+    </w:p>
+    <w:tbl>
+      <w:tblPr>
+        <w:tblW w:type="auto" w:w="0"/>
+        <w:jc w:val="center"/>
+        <w:tblLook w:firstColumn="1" w:firstRow="1" w:lastColumn="0" w:lastRow="0" w:noHBand="0" w:noVBand="1" w:val="04A0"/>
+      </w:tblPr>
+      <w:tblGrid>
+        <w:gridCol w:w="9792"/>
+      </w:tblGrid>
+      <w:tr>
+        <w:tc>
+          <w:tcPr>
+            <w:tcW w:type="dxa" w:w="9792"/>
+            <w:shd w:fill="F5F6F8"/>
+            <w:tcMar>
+              <w:top w:w="80" w:type="dxa"/>
+              <w:bottom w:w="80" w:type="dxa"/>
+              <w:left w:w="140" w:type="dxa"/>
+              <w:right w:w="140" w:type="dxa"/>
+            </w:tcMar>
+            <w:tcBorders>
+              <w:left w:val="single" w:sz="18" w:space="0" w:color="CBD5E0"/>
+              <w:top w:val="none"/>
+              <w:right w:val="none"/>
+              <w:bottom w:val="none"/>
+            </w:tcBorders>
+          </w:tcPr>
+          <w:p>
+            <w:pPr>
+              <w:spacing w:line="240" w:lineRule="auto" w:after="0"/>
+            </w:pPr>
+            <w:r>
+              <w:rPr>
+                <w:rFonts w:ascii="Consolas" w:hAnsi="Consolas"/>
+                <w:color w:val="2D3748"/>
+                <w:sz w:val="18"/>
+              </w:rPr>
+              <w:t xml:space="preserve">               Drain Current (Id) vs. Drain-to-Source Voltage (Vds)</w:t>
+              <w:br/>
+              <w:t xml:space="preserve">   Id ^</w:t>
+              <w:br/>
+              <w:t xml:space="preserve">      │                                                     Vgs = 12V (Deep Triode &amp; Saturation)</w:t>
+              <w:br/>
+              <w:t xml:space="preserve">      │                                                .─────────────────────────── / / ───┐ Avalanche</w:t>
+              <w:br/>
+              <w:t xml:space="preserve">      │                                           .───'                                    │ Breakdown</w:t>
+              <w:br/>
+              <w:t xml:space="preserve">      │                                      .───'            Vgs = 10V                    │ (V_BR)</w:t>
+              <w:br/>
+              <w:t xml:space="preserve">      │                                 .───'            .───────────────────────── / / ───┤</w:t>
+              <w:br/>
+              <w:t xml:space="preserve">      │                            .───'            .───'                                  │</w:t>
+              <w:br/>
+              <w:t xml:space="preserve">      │                       .───'            .───'          Vgs = 8V                     │</w:t>
+              <w:br/>
+              <w:t xml:space="preserve">      │                  .───'            .───'          .───────────────────────── / / ───┤</w:t>
+              <w:br/>
+              <w:t xml:space="preserve">      │             .───'            .───'          .───'                                  │</w:t>
+              <w:br/>
+              <w:t xml:space="preserve">      │        .───'            .───'          .───'          Vgs = 6V                     │</w:t>
+              <w:br/>
+              <w:t xml:space="preserve">      │   .───'            .───'          .───'          .───────────────────────── / / ───┤</w:t>
+              <w:br/>
+              <w:t xml:space="preserve">      │  /            .───'          .───'          .───'                                  │</w:t>
+              <w:br/>
+              <w:t xml:space="preserve">      │ /        .───'          .───'          .───'          Vgs = 4V                     │</w:t>
+              <w:br/>
+              <w:t xml:space="preserve">      │/    .───'          .───'          .───'          .───────────────────────── / / ───┤</w:t>
+              <w:br/>
+              <w:t xml:space="preserve">      │ .──'          .───'          .───'          .───'                                  │</w:t>
+              <w:br/>
+              <w:t xml:space="preserve">      │/         .───'          .───'          .───'                                       │</w:t>
+              <w:br/>
+              <w:t xml:space="preserve">      │     .───'          .───'          .───'               Vgs = 2V = Vth (Weak Inversion)</w:t>
+              <w:br/>
+              <w:t xml:space="preserve">      │.───'          .───'          .───'               .───────────────────────── / / ───┤</w:t>
+              <w:br/>
+              <w:t xml:space="preserve">      │          .───'          .───'               .───'                                  │</w:t>
+              <w:br/>
+              <w:t xml:space="preserve">      │     .───'          .───'               .───'                                       │</w:t>
+              <w:br/>
+              <w:t xml:space="preserve">      ├────'──────────'───────────'───────────'─────────────── Vgs &lt; Vth (Cutoff: Id ~ 0)──┴───────</w:t>
+              <w:br/>
+              <w:t xml:space="preserve">      │ ◄───────────► │ ◄─────────────────────────────────────────────► │ ◄──────────────────────►</w:t>
+              <w:br/>
+              <w:t xml:space="preserve">      0    Linear /      Pinch-Off Boundary          Saturation / Active          Avalanche Breakdown</w:t>
+              <w:br/>
+              <w:t xml:space="preserve">         Triode Region    Vds = Vgs - Vth                  Region                    Vds &gt;= V_BR(DSS)</w:t>
+              <w:br/>
+              <w:t xml:space="preserve">        (Vds &lt; Vgs-Vth)   (Channel collapsed           (Vds &gt;= Vgs-Vth)              (Impact Ionization)</w:t>
+              <w:br/>
+              <w:t xml:space="preserve">       Rds_on = Vds/Id        at Drain)              Id = 0.5*kn*(Vgs-Vth)^2</w:t>
+            </w:r>
+          </w:p>
+        </w:tc>
+      </w:tr>
+    </w:tbl>
+    <w:p/>
+    <w:p>
+      <w:pPr>
+        <w:spacing w:before="120" w:after="40"/>
+      </w:pPr>
+      <w:r>
+        <w:rPr>
+          <w:b/>
+          <w:color w:val="282C34"/>
+          <w:sz w:val="22"/>
+        </w:rPr>
+        <w:t>Regional Mechanics Breakdown:</w:t>
+      </w:r>
+    </w:p>
+    <w:p>
+      <w:pPr>
+        <w:pStyle w:val="ListNumber"/>
+        <w:spacing w:after="40"/>
+        <w:ind w:left="360"/>
+      </w:pPr>
+      <w:r>
+        <w:rPr>
+          <w:b/>
+          <w:color w:val="282C34"/>
+          <w:sz w:val="21"/>
+        </w:rPr>
+        <w:t>Cutoff Region ($V_{GS} &lt; V_{TH}$)</w:t>
+      </w:r>
+      <w:r>
+        <w:rPr>
+          <w:color w:val="282C34"/>
+          <w:sz w:val="21"/>
+        </w:rPr>
+        <w:t>:</w:t>
+      </w:r>
+    </w:p>
+    <w:p>
+      <w:pPr>
+        <w:pStyle w:val="ListBullet"/>
+        <w:spacing w:after="40"/>
+        <w:ind w:left="720"/>
+      </w:pPr>
+      <w:r>
+        <w:rPr>
+          <w:color w:val="282C34"/>
+          <w:sz w:val="21"/>
+        </w:rPr>
+        <w:t>No surface inversion channel exists.</w:t>
+      </w:r>
+    </w:p>
+    <w:p>
+      <w:pPr>
+        <w:pStyle w:val="ListBullet"/>
+        <w:spacing w:after="40"/>
+        <w:ind w:left="720"/>
+      </w:pPr>
+      <w:r>
+        <w:rPr>
+          <w:color w:val="282C34"/>
+          <w:sz w:val="21"/>
+        </w:rPr>
+        <w:t>Conduction is limited to microscopic subthreshold diffusion leakage (</w:t>
       </w:r>
       <w:r>
         <w:rPr>
@@ -3844,33 +3893,93 @@
           <w:color w:val="145AA0"/>
           <w:sz w:val="21"/>
         </w:rPr>
-        <w:t>I_D</w:t>
-      </w:r>
-      <w:r>
-        <w:rPr>
-          <w:color w:val="282C34"/>
-          <w:sz w:val="21"/>
-        </w:rPr>
-        <w:t xml:space="preserve"> overlap, dissipating instantaneous energy:</w:t>
+        <w:t>I_D \approx pA \dots nA</w:t>
+      </w:r>
+      <w:r>
+        <w:rPr>
+          <w:color w:val="282C34"/>
+          <w:sz w:val="21"/>
+        </w:rPr>
+        <w:t>).</w:t>
       </w:r>
     </w:p>
     <w:p>
       <w:pPr>
-        <w:spacing w:after="80"/>
-      </w:pPr>
+        <w:pStyle w:val="ListNumber"/>
+        <w:spacing w:after="40"/>
+        <w:ind w:left="360"/>
+      </w:pPr>
+      <w:r>
+        <w:rPr>
+          <w:b/>
+          <w:color w:val="282C34"/>
+          <w:sz w:val="21"/>
+        </w:rPr>
+        <w:t>Linear / Triode / Ohmic Region ($V_{GS} &gt; V_{TH}$ and $V_{DS} &lt; V_{GS} - V_{TH}$)</w:t>
+      </w:r>
+      <w:r>
+        <w:rPr>
+          <w:color w:val="282C34"/>
+          <w:sz w:val="21"/>
+        </w:rPr>
+        <w:t>:</w:t>
+      </w:r>
+    </w:p>
+    <w:p>
+      <w:pPr>
+        <w:pStyle w:val="ListBullet"/>
+        <w:spacing w:after="40"/>
+        <w:ind w:left="720"/>
+      </w:pPr>
+      <w:r>
+        <w:rPr>
+          <w:color w:val="282C34"/>
+          <w:sz w:val="21"/>
+        </w:rPr>
+        <w:t>The inversion channel connects Source directly to Drain with uniform electron depth.</w:t>
+      </w:r>
+    </w:p>
+    <w:p>
+      <w:pPr>
+        <w:pStyle w:val="ListBullet"/>
+        <w:spacing w:after="40"/>
+        <w:ind w:left="720"/>
+      </w:pPr>
+      <w:r>
+        <w:rPr>
+          <w:color w:val="282C34"/>
+          <w:sz w:val="21"/>
+        </w:rPr>
+        <w:t>The device behaves as a precision, voltage-variable linear resistor (</w:t>
+      </w:r>
       <w:r>
         <w:rPr>
           <w:i/>
           <w:color w:val="145AA0"/>
           <w:sz w:val="21"/>
         </w:rPr>
-      </w:r>
-      <w:r>
-        <w:rPr>
-          <w:color w:val="282C34"/>
-          <w:sz w:val="21"/>
-        </w:rPr>
-        <w:t>P_{SW} = \frac{1}{2} V_{DS,bus} \cdot I_{D,load} \cdot (t_{rise} + t_{fall}) \cdot f_{sw}</w:t>
+        <w:t>R_{DS(on)</w:t>
+      </w:r>
+      <w:r>
+        <w:rPr>
+          <w:color w:val="282C34"/>
+          <w:sz w:val="21"/>
+        </w:rPr>
+        <w:t>).</w:t>
+      </w:r>
+    </w:p>
+    <w:p>
+      <w:pPr>
+        <w:pStyle w:val="ListBullet"/>
+        <w:spacing w:after="40"/>
+        <w:ind w:left="720"/>
+      </w:pPr>
+      <w:r>
+        <w:rPr>
+          <w:color w:val="282C34"/>
+          <w:sz w:val="21"/>
+        </w:rPr>
+        <w:t xml:space="preserve">Higher </w:t>
       </w:r>
       <w:r>
         <w:rPr>
@@ -3878,6 +3987,29 @@
           <w:color w:val="145AA0"/>
           <w:sz w:val="21"/>
         </w:rPr>
+        <w:t>V_{GS</w:t>
+      </w:r>
+      <w:r>
+        <w:rPr>
+          <w:color w:val="282C34"/>
+          <w:sz w:val="21"/>
+        </w:rPr>
+        <w:t xml:space="preserve"> overdrive widens the channel, reducing </w:t>
+      </w:r>
+      <w:r>
+        <w:rPr>
+          <w:i/>
+          <w:color w:val="145AA0"/>
+          <w:sz w:val="21"/>
+        </w:rPr>
+        <w:t>R_{DS(on)</w:t>
+      </w:r>
+      <w:r>
+        <w:rPr>
+          <w:color w:val="282C34"/>
+          <w:sz w:val="21"/>
+        </w:rPr>
+        <w:t>:</w:t>
       </w:r>
     </w:p>
     <w:p>
@@ -3886,25 +4018,17 @@
       </w:pPr>
       <w:r>
         <w:rPr>
-          <w:color w:val="282C34"/>
-          <w:sz w:val="21"/>
-        </w:rPr>
-        <w:t xml:space="preserve">where </w:t>
-      </w:r>
-      <w:r>
-        <w:rPr>
           <w:i/>
           <w:color w:val="145AA0"/>
           <w:sz w:val="21"/>
         </w:rPr>
-        <w:t>t_{rise</w:t>
-      </w:r>
-      <w:r>
-        <w:rPr>
-          <w:color w:val="282C34"/>
-          <w:sz w:val="21"/>
-        </w:rPr>
-        <w:t xml:space="preserve"> and </w:t>
+      </w:r>
+      <w:r>
+        <w:rPr>
+          <w:color w:val="282C34"/>
+          <w:sz w:val="21"/>
+        </w:rPr>
+        <w:t>R_{DS(on)} = \frac{V_{DS}}{I_D} \approx \frac{1}{\mu_n C_{ox} \left(\frac{W}{L}\right)(V_{GS} - V_{TH})}</w:t>
       </w:r>
       <w:r>
         <w:rPr>
@@ -3912,14 +4036,42 @@
           <w:color w:val="145AA0"/>
           <w:sz w:val="21"/>
         </w:rPr>
-        <w:t>t_{fall</w:t>
-      </w:r>
-      <w:r>
-        <w:rPr>
-          <w:color w:val="282C34"/>
-          <w:sz w:val="21"/>
-        </w:rPr>
-        <w:t xml:space="preserve"> are governed by the gate driver source/sink current capability and gate charge (</w:t>
+      </w:r>
+    </w:p>
+    <w:p>
+      <w:pPr>
+        <w:pStyle w:val="ListNumber"/>
+        <w:spacing w:after="40"/>
+        <w:ind w:left="360"/>
+      </w:pPr>
+      <w:r>
+        <w:rPr>
+          <w:b/>
+          <w:color w:val="282C34"/>
+          <w:sz w:val="21"/>
+        </w:rPr>
+        <w:t>Pinch-Off Boundary ($V_{DS} = V_{GS} - V_{TH}$)</w:t>
+      </w:r>
+      <w:r>
+        <w:rPr>
+          <w:color w:val="282C34"/>
+          <w:sz w:val="21"/>
+        </w:rPr>
+        <w:t>:</w:t>
+      </w:r>
+    </w:p>
+    <w:p>
+      <w:pPr>
+        <w:pStyle w:val="ListBullet"/>
+        <w:spacing w:after="40"/>
+        <w:ind w:left="720"/>
+      </w:pPr>
+      <w:r>
+        <w:rPr>
+          <w:color w:val="282C34"/>
+          <w:sz w:val="21"/>
+        </w:rPr>
+        <w:t xml:space="preserve">The voltage drop across the oxide at the drain end reaches exactly </w:t>
       </w:r>
       <w:r>
         <w:rPr>
@@ -3927,15 +4079,223 @@
           <w:color w:val="145AA0"/>
           <w:sz w:val="21"/>
         </w:rPr>
-        <w:t>Q_{gs2 + Q_{gd</w:t>
-      </w:r>
-      <w:r>
-        <w:rPr>
-          <w:color w:val="282C34"/>
-          <w:sz w:val="21"/>
-        </w:rPr>
-        <w:t>).</w:t>
-      </w:r>
+        <w:t>V_{TH</w:t>
+      </w:r>
+      <w:r>
+        <w:rPr>
+          <w:color w:val="282C34"/>
+          <w:sz w:val="21"/>
+        </w:rPr>
+        <w:t>.</w:t>
+      </w:r>
+    </w:p>
+    <w:p>
+      <w:pPr>
+        <w:pStyle w:val="ListBullet"/>
+        <w:spacing w:after="40"/>
+        <w:ind w:left="720"/>
+      </w:pPr>
+      <w:r>
+        <w:rPr>
+          <w:color w:val="282C34"/>
+          <w:sz w:val="21"/>
+        </w:rPr>
+        <w:t>The inversion channel depth collapses to zero at the drain junction, forming the pinch-off point.</w:t>
+      </w:r>
+    </w:p>
+    <w:p>
+      <w:pPr>
+        <w:pStyle w:val="ListNumber"/>
+        <w:spacing w:after="40"/>
+        <w:ind w:left="360"/>
+      </w:pPr>
+      <w:r>
+        <w:rPr>
+          <w:b/>
+          <w:color w:val="282C34"/>
+          <w:sz w:val="21"/>
+        </w:rPr>
+        <w:t>Saturation (Active) Region ($V_{GS} &gt; V_{TH}$ and $V_{DS} \ge V_{GS} - V_{TH}$)</w:t>
+      </w:r>
+      <w:r>
+        <w:rPr>
+          <w:color w:val="282C34"/>
+          <w:sz w:val="21"/>
+        </w:rPr>
+        <w:t>:</w:t>
+      </w:r>
+    </w:p>
+    <w:p>
+      <w:pPr>
+        <w:pStyle w:val="ListBullet"/>
+        <w:spacing w:after="40"/>
+        <w:ind w:left="720"/>
+      </w:pPr>
+      <w:r>
+        <w:rPr>
+          <w:color w:val="282C34"/>
+          <w:sz w:val="21"/>
+        </w:rPr>
+        <w:t xml:space="preserve">Increasing </w:t>
+      </w:r>
+      <w:r>
+        <w:rPr>
+          <w:i/>
+          <w:color w:val="145AA0"/>
+          <w:sz w:val="21"/>
+        </w:rPr>
+        <w:t>V_{DS</w:t>
+      </w:r>
+      <w:r>
+        <w:rPr>
+          <w:color w:val="282C34"/>
+          <w:sz w:val="21"/>
+        </w:rPr>
+        <w:t xml:space="preserve"> beyond pinch-off does not widen the channel; instead, the excess voltage drops across the drain depletion zone.</w:t>
+      </w:r>
+    </w:p>
+    <w:p>
+      <w:pPr>
+        <w:pStyle w:val="ListBullet"/>
+        <w:spacing w:after="40"/>
+        <w:ind w:left="720"/>
+      </w:pPr>
+      <w:r>
+        <w:rPr>
+          <w:color w:val="282C34"/>
+          <w:sz w:val="21"/>
+        </w:rPr>
+        <w:t>Current saturates to a constant level governed by the gate overdrive square law:</w:t>
+      </w:r>
+    </w:p>
+    <w:p>
+      <w:pPr>
+        <w:spacing w:after="80"/>
+      </w:pPr>
+      <w:r>
+        <w:rPr>
+          <w:i/>
+          <w:color w:val="145AA0"/>
+          <w:sz w:val="21"/>
+        </w:rPr>
+      </w:r>
+      <w:r>
+        <w:rPr>
+          <w:color w:val="282C34"/>
+          <w:sz w:val="21"/>
+        </w:rPr>
+        <w:t>I_D = \frac{1}{2} \mu_n C_{ox} \left(\frac{W}{L}\right) (V_{GS} - V_{TH})^2 (1 + \lambda V_{DS})</w:t>
+      </w:r>
+      <w:r>
+        <w:rPr>
+          <w:i/>
+          <w:color w:val="145AA0"/>
+          <w:sz w:val="21"/>
+        </w:rPr>
+      </w:r>
+    </w:p>
+    <w:p>
+      <w:pPr>
+        <w:pStyle w:val="ListBullet"/>
+        <w:spacing w:after="40"/>
+        <w:ind w:left="720"/>
+      </w:pPr>
+      <w:r>
+        <w:rPr>
+          <w:color w:val="282C34"/>
+          <w:sz w:val="21"/>
+        </w:rPr>
+        <w:t xml:space="preserve">The slight upward slope of the saturation curve is caused by </w:t>
+      </w:r>
+      <w:r>
+        <w:rPr>
+          <w:b/>
+          <w:color w:val="282C34"/>
+          <w:sz w:val="21"/>
+        </w:rPr>
+        <w:t>Channel Length Modulation ($\lambda$)</w:t>
+      </w:r>
+      <w:r>
+        <w:rPr>
+          <w:color w:val="282C34"/>
+          <w:sz w:val="21"/>
+        </w:rPr>
+        <w:t xml:space="preserve">, where high </w:t>
+      </w:r>
+      <w:r>
+        <w:rPr>
+          <w:i/>
+          <w:color w:val="145AA0"/>
+          <w:sz w:val="21"/>
+        </w:rPr>
+        <w:t>V_{DS</w:t>
+      </w:r>
+      <w:r>
+        <w:rPr>
+          <w:color w:val="282C34"/>
+          <w:sz w:val="21"/>
+        </w:rPr>
+        <w:t xml:space="preserve"> shortens the effective channel length </w:t>
+      </w:r>
+      <w:r>
+        <w:rPr>
+          <w:i/>
+          <w:color w:val="145AA0"/>
+          <w:sz w:val="21"/>
+        </w:rPr>
+        <w:t>L_{eff</w:t>
+      </w:r>
+      <w:r>
+        <w:rPr>
+          <w:color w:val="282C34"/>
+          <w:sz w:val="21"/>
+        </w:rPr>
+        <w:t>.</w:t>
+      </w:r>
+    </w:p>
+    <w:p>
+      <w:pPr>
+        <w:pStyle w:val="ListNumber"/>
+        <w:spacing w:after="40"/>
+        <w:ind w:left="360"/>
+      </w:pPr>
+      <w:r>
+        <w:rPr>
+          <w:b/>
+          <w:color w:val="282C34"/>
+          <w:sz w:val="21"/>
+        </w:rPr>
+        <w:t>Avalanche Breakdown Region ($V_{DS} \ge V_{BR(DSS)}$)</w:t>
+      </w:r>
+      <w:r>
+        <w:rPr>
+          <w:color w:val="282C34"/>
+          <w:sz w:val="21"/>
+        </w:rPr>
+        <w:t>:</w:t>
+      </w:r>
+    </w:p>
+    <w:p>
+      <w:pPr>
+        <w:pStyle w:val="ListBullet"/>
+        <w:spacing w:after="40"/>
+        <w:ind w:left="720"/>
+      </w:pPr>
+      <w:r>
+        <w:rPr>
+          <w:color w:val="282C34"/>
+          <w:sz w:val="21"/>
+        </w:rPr>
+        <w:t>High electric field across the reverse-biased drain-body p-n junction triggers impact ionization, multiplying carriers exponentially.</w:t>
+      </w:r>
+    </w:p>
+    <w:p>
+      <w:pPr>
+        <w:spacing w:before="80" w:after="80"/>
+        <w:pBdr>
+          <w:bottom w:val="single" w:sz="6" w:space="1" w:color="E2E8F0"/>
+        </w:pBdr>
+      </w:pPr>
     </w:p>
     <w:p>
       <w:pPr>
@@ -3947,7 +4307,7 @@
           <w:color w:val="4682B4"/>
           <w:sz w:val="24"/>
         </w:rPr>
-        <w:t>3. Gate Drive Power Loss (</w:t>
+        <w:t>6.2 Transfer Characteristics Waveforms (</w:t>
       </w:r>
       <w:r>
         <w:rPr>
@@ -3956,7 +4316,7 @@
           <w:color w:val="145AA0"/>
           <w:sz w:val="24"/>
         </w:rPr>
-        <w:t>P_{GATE</w:t>
+        <w:t>I_D</w:t>
       </w:r>
       <w:r>
         <w:rPr>
@@ -3964,71 +4324,7 @@
           <w:color w:val="4682B4"/>
           <w:sz w:val="24"/>
         </w:rPr>
-        <w:t>):</w:t>
-      </w:r>
-    </w:p>
-    <w:p>
-      <w:pPr>
-        <w:spacing w:after="80"/>
-      </w:pPr>
-      <w:r>
-        <w:rPr>
-          <w:color w:val="282C34"/>
-          <w:sz w:val="21"/>
-        </w:rPr>
-        <w:t>Power delivered by the gate driver supply rail to charge and discharge the input capacitance:</w:t>
-      </w:r>
-    </w:p>
-    <w:p>
-      <w:pPr>
-        <w:spacing w:after="80"/>
-      </w:pPr>
-      <w:r>
-        <w:rPr>
-          <w:i/>
-          <w:color w:val="145AA0"/>
-          <w:sz w:val="21"/>
-        </w:rPr>
-      </w:r>
-      <w:r>
-        <w:rPr>
-          <w:color w:val="282C34"/>
-          <w:sz w:val="21"/>
-        </w:rPr>
-        <w:t>P_{GATE} = Q_g \times V_{GS,drive} \times f_{sw}</w:t>
-      </w:r>
-      <w:r>
-        <w:rPr>
-          <w:i/>
-          <w:color w:val="145AA0"/>
-          <w:sz w:val="21"/>
-        </w:rPr>
-      </w:r>
-    </w:p>
-    <w:p>
-      <w:pPr>
-        <w:spacing w:after="80"/>
-      </w:pPr>
-      <w:r>
-        <w:rPr>
-          <w:i/>
-          <w:color w:val="282C34"/>
-          <w:sz w:val="21"/>
-        </w:rPr>
-        <w:t>(Note: Most of this loss is dissipated inside the gate resistor $R_G$ and gate driver output stage).</w:t>
-      </w:r>
-    </w:p>
-    <w:p>
-      <w:pPr>
-        <w:spacing w:before="160" w:after="80"/>
-      </w:pPr>
-      <w:r>
-        <w:rPr>
-          <w:b/>
-          <w:color w:val="4682B4"/>
-          <w:sz w:val="24"/>
-        </w:rPr>
-        <w:t>4. Output Capacitive Stored Energy Loss (</w:t>
+        <w:t xml:space="preserve"> vs. </w:t>
       </w:r>
       <w:r>
         <w:rPr>
@@ -4037,7 +4333,7 @@
           <w:color w:val="145AA0"/>
           <w:sz w:val="24"/>
         </w:rPr>
-        <w:t>P_{COSS</w:t>
+        <w:t>V_{GS</w:t>
       </w:r>
       <w:r>
         <w:rPr>
@@ -4045,7 +4341,7 @@
           <w:color w:val="4682B4"/>
           <w:sz w:val="24"/>
         </w:rPr>
-        <w:t>):</w:t>
+        <w:t>)</w:t>
       </w:r>
     </w:p>
     <w:p>
@@ -4057,7 +4353,105 @@
           <w:color w:val="282C34"/>
           <w:sz w:val="21"/>
         </w:rPr>
-        <w:t xml:space="preserve">During hard-switching turn-on, the energy stored in </w:t>
+        <w:t>Transfer curves illustrate drain current response to gate bias, plotted on both linear and logarithmic scales:</w:t>
+      </w:r>
+    </w:p>
+    <w:tbl>
+      <w:tblPr>
+        <w:tblW w:type="auto" w:w="0"/>
+        <w:jc w:val="center"/>
+        <w:tblLook w:firstColumn="1" w:firstRow="1" w:lastColumn="0" w:lastRow="0" w:noHBand="0" w:noVBand="1" w:val="04A0"/>
+      </w:tblPr>
+      <w:tblGrid>
+        <w:gridCol w:w="9792"/>
+      </w:tblGrid>
+      <w:tr>
+        <w:tc>
+          <w:tcPr>
+            <w:tcW w:type="dxa" w:w="9792"/>
+            <w:shd w:fill="F5F6F8"/>
+            <w:tcMar>
+              <w:top w:w="80" w:type="dxa"/>
+              <w:bottom w:w="80" w:type="dxa"/>
+              <w:left w:w="140" w:type="dxa"/>
+              <w:right w:w="140" w:type="dxa"/>
+            </w:tcMar>
+            <w:tcBorders>
+              <w:left w:val="single" w:sz="18" w:space="0" w:color="CBD5E0"/>
+              <w:top w:val="none"/>
+              <w:right w:val="none"/>
+              <w:bottom w:val="none"/>
+            </w:tcBorders>
+          </w:tcPr>
+          <w:p>
+            <w:pPr>
+              <w:spacing w:line="240" w:lineRule="auto" w:after="0"/>
+            </w:pPr>
+            <w:r>
+              <w:rPr>
+                <w:rFonts w:ascii="Consolas" w:hAnsi="Consolas"/>
+                <w:color w:val="2D3748"/>
+                <w:sz w:val="18"/>
+              </w:rPr>
+              <w:t xml:space="preserve">       Linear Scale: Strong Inversion                   Logarithmic Scale: Subthreshold Swing</w:t>
+              <w:br/>
+              <w:t xml:space="preserve">   Id ^                                              log(Id)^</w:t>
+              <w:br/>
+              <w:t xml:space="preserve">      │                          Saturation Regime          │             Strong Inversion</w:t>
+              <w:br/>
+              <w:t xml:space="preserve">      │                          Id ~ (Vgs - Vth)^2   10^-2 ┼                (Ohmic / Saturation)</w:t>
+              <w:br/>
+              <w:t xml:space="preserve">      │                                   .─'               │                  /</w:t>
+              <w:br/>
+              <w:t xml:space="preserve">      │                                .─'            10^-4 ┼                 /</w:t>
+              <w:br/>
+              <w:t xml:space="preserve">      │                             .─'                     │                /</w:t>
+              <w:br/>
+              <w:t xml:space="preserve">      │                          .─'                  10^-6 ┼               /</w:t>
+              <w:br/>
+              <w:t xml:space="preserve">      │                       .─'                           │              /</w:t>
+              <w:br/>
+              <w:t xml:space="preserve">      │                    .─'                        10^-8 ┼             / Subthreshold Regime</w:t>
+              <w:br/>
+              <w:t xml:space="preserve">      │                 .─'                                 │            /  Id ~ exp(q*(Vgs-Vth)/(n*k*T))</w:t>
+              <w:br/>
+              <w:t xml:space="preserve">      │              .─'                                    │           /   Subthreshold Swing:</w:t>
+              <w:br/>
+              <w:t xml:space="preserve">      │           .─'                                10^-10 ┼          /    S = dVgs / d(log10 Id) ~ 70mV/dec</w:t>
+              <w:br/>
+              <w:t xml:space="preserve">      │        .─'                                          │         /</w:t>
+              <w:br/>
+              <w:t xml:space="preserve">      │     .─'    Subthreshold Exponential Leakage  10^-12 ┼────────/  &lt;-- I_off floor (Drain-to-Source leakage)</w:t>
+              <w:br/>
+              <w:t xml:space="preserve">      └─────┴────────────────────────────────&gt; Vgs          └────────┴─────────────────────────────&gt; Vgs</w:t>
+              <w:br/>
+              <w:t xml:space="preserve">      0    Vth                                              0       Vth</w:t>
+            </w:r>
+          </w:p>
+        </w:tc>
+      </w:tr>
+    </w:tbl>
+    <w:p/>
+    <w:p>
+      <w:pPr>
+        <w:pStyle w:val="ListBullet"/>
+        <w:spacing w:after="40"/>
+        <w:ind w:left="360"/>
+      </w:pPr>
+      <w:r>
+        <w:rPr>
+          <w:b/>
+          <w:color w:val="282C34"/>
+          <w:sz w:val="21"/>
+        </w:rPr>
+        <w:t>Linear Transfer Curve</w:t>
+      </w:r>
+      <w:r>
+        <w:rPr>
+          <w:color w:val="282C34"/>
+          <w:sz w:val="21"/>
+        </w:rPr>
+        <w:t>: Shows the square-law quadratic relationship (</w:t>
       </w:r>
       <w:r>
         <w:rPr>
@@ -4065,34 +4459,102 @@
           <w:color w:val="145AA0"/>
           <w:sz w:val="21"/>
         </w:rPr>
-        <w:t>C_{oss</w:t>
-      </w:r>
-      <w:r>
-        <w:rPr>
-          <w:color w:val="282C34"/>
-          <w:sz w:val="21"/>
-        </w:rPr>
-        <w:t xml:space="preserve"> is dissipated directly into the MOSFET channel:</w:t>
+        <w:t>I_D \propto (V_{GS - V_{TH)^2</w:t>
+      </w:r>
+      <w:r>
+        <w:rPr>
+          <w:color w:val="282C34"/>
+          <w:sz w:val="21"/>
+        </w:rPr>
+        <w:t xml:space="preserve">) in saturation and provides the graphical extraction point for </w:t>
+      </w:r>
+      <w:r>
+        <w:rPr>
+          <w:i/>
+          <w:color w:val="145AA0"/>
+          <w:sz w:val="21"/>
+        </w:rPr>
+        <w:t>V_{TH</w:t>
+      </w:r>
+      <w:r>
+        <w:rPr>
+          <w:color w:val="282C34"/>
+          <w:sz w:val="21"/>
+        </w:rPr>
+        <w:t>.</w:t>
       </w:r>
     </w:p>
     <w:p>
       <w:pPr>
-        <w:spacing w:after="80"/>
-      </w:pPr>
+        <w:pStyle w:val="ListBullet"/>
+        <w:spacing w:after="40"/>
+        <w:ind w:left="360"/>
+      </w:pPr>
+      <w:r>
+        <w:rPr>
+          <w:b/>
+          <w:color w:val="282C34"/>
+          <w:sz w:val="21"/>
+        </w:rPr>
+        <w:t>Logarithmic Transfer Curve</w:t>
+      </w:r>
+      <w:r>
+        <w:rPr>
+          <w:color w:val="282C34"/>
+          <w:sz w:val="21"/>
+        </w:rPr>
+        <w:t xml:space="preserve">: Depicts the exponential </w:t>
+      </w:r>
+      <w:r>
+        <w:rPr>
+          <w:b/>
+          <w:color w:val="282C34"/>
+          <w:sz w:val="21"/>
+        </w:rPr>
+        <w:t>subthreshold region</w:t>
+      </w:r>
+      <w:r>
+        <w:rPr>
+          <w:color w:val="282C34"/>
+          <w:sz w:val="21"/>
+        </w:rPr>
+        <w:t xml:space="preserve"> (</w:t>
+      </w:r>
       <w:r>
         <w:rPr>
           <w:i/>
           <w:color w:val="145AA0"/>
           <w:sz w:val="21"/>
         </w:rPr>
-      </w:r>
-      <w:r>
-        <w:rPr>
-          <w:color w:val="282C34"/>
-          <w:sz w:val="21"/>
-        </w:rPr>
-        <w:t>P_{COSS} = \frac{1}{2} C_{oss(er)} \cdot V_{DS}^2 \cdot f_{sw} = f_{sw} \int_0^{V_{DS}} v \cdot C_{oss}(v) \, dv</w:t>
-      </w:r>
+        <w:t>V_{GS &lt; V_{TH</w:t>
+      </w:r>
+      <w:r>
+        <w:rPr>
+          <w:color w:val="282C34"/>
+          <w:sz w:val="21"/>
+        </w:rPr>
+        <w:t xml:space="preserve">). The slope is defined by the </w:t>
+      </w:r>
+      <w:r>
+        <w:rPr>
+          <w:b/>
+          <w:color w:val="282C34"/>
+          <w:sz w:val="21"/>
+        </w:rPr>
+        <w:t>Subthreshold Swing ($S$)</w:t>
+      </w:r>
+      <w:r>
+        <w:rPr>
+          <w:color w:val="282C34"/>
+          <w:sz w:val="21"/>
+        </w:rPr>
+        <w:t>:</w:t>
+      </w:r>
+    </w:p>
+    <w:p>
+      <w:pPr>
+        <w:spacing w:after="80"/>
+      </w:pPr>
       <w:r>
         <w:rPr>
           <w:i/>
@@ -4100,6 +4562,40 @@
           <w:sz w:val="21"/>
         </w:rPr>
       </w:r>
+      <w:r>
+        <w:rPr>
+          <w:color w:val="282C34"/>
+          <w:sz w:val="21"/>
+        </w:rPr>
+        <w:t>S = \ln(10) \cdot \frac{k T}{q} \cdot \left(1 + \frac{C_{dep}}{C_{ox}}\right) \approx 60\,\text{mV/decade to } 90\,\text{mV/decade at } 300\,\text{K}</w:t>
+      </w:r>
+      <w:r>
+        <w:rPr>
+          <w:i/>
+          <w:color w:val="145AA0"/>
+          <w:sz w:val="21"/>
+        </w:rPr>
+      </w:r>
+    </w:p>
+    <w:p>
+      <w:pPr>
+        <w:spacing w:after="80"/>
+      </w:pPr>
+      <w:r>
+        <w:rPr>
+          <w:color w:val="282C34"/>
+          <w:sz w:val="21"/>
+        </w:rPr>
+        <w:t>This parameter governs off-state leakage power dissipation in microelectronics and battery disconnects.</w:t>
+      </w:r>
+    </w:p>
+    <w:p>
+      <w:pPr>
+        <w:spacing w:before="80" w:after="80"/>
+        <w:pBdr>
+          <w:bottom w:val="single" w:sz="6" w:space="1" w:color="E2E8F0"/>
+        </w:pBdr>
+      </w:pPr>
     </w:p>
     <w:p>
       <w:pPr>
@@ -4111,7 +4607,7 @@
           <w:color w:val="4682B4"/>
           <w:sz w:val="24"/>
         </w:rPr>
-        <w:t>5. Body Diode Conduction &amp; Reverse Recovery Loss (</w:t>
+        <w:t>6.3 Third-Quadrant Reverse Conduction Waveforms (</w:t>
       </w:r>
       <w:r>
         <w:rPr>
@@ -4120,7 +4616,7 @@
           <w:color w:val="145AA0"/>
           <w:sz w:val="24"/>
         </w:rPr>
-        <w:t>P_{DIODE</w:t>
+        <w:t>V_{DS &lt; 0\,V</w:t>
       </w:r>
       <w:r>
         <w:rPr>
@@ -4128,7 +4624,7 @@
           <w:color w:val="4682B4"/>
           <w:sz w:val="24"/>
         </w:rPr>
-        <w:t>):</w:t>
+        <w:t>)</w:t>
       </w:r>
     </w:p>
     <w:p>
@@ -4140,74 +4636,106 @@
           <w:color w:val="282C34"/>
           <w:sz w:val="21"/>
         </w:rPr>
-        <w:t>In half-bridge and synchronous converters during dead-time:</w:t>
-      </w:r>
-    </w:p>
-    <w:p>
-      <w:pPr>
-        <w:spacing w:after="80"/>
-      </w:pPr>
+        <w:t xml:space="preserve">In inductive half-bridges, current naturally flows in reverse (Source to Drain, </w:t>
+      </w:r>
       <w:r>
         <w:rPr>
           <w:i/>
           <w:color w:val="145AA0"/>
           <w:sz w:val="21"/>
         </w:rPr>
-      </w:r>
-      <w:r>
-        <w:rPr>
-          <w:color w:val="282C34"/>
-          <w:sz w:val="21"/>
-        </w:rPr>
-        <w:t>P_{DIODE} = (V_{SD} \cdot I_{LOAD} \cdot t_{dead} \cdot f_{sw}) + (Q_{rr} \cdot V_{DS,bus} \cdot f_{sw})</w:t>
-      </w:r>
-      <w:r>
-        <w:rPr>
-          <w:i/>
-          <w:color w:val="145AA0"/>
-          <w:sz w:val="21"/>
-        </w:rPr>
+        <w:t>V_{DS &lt; 0\,V</w:t>
+      </w:r>
+      <w:r>
+        <w:rPr>
+          <w:color w:val="282C34"/>
+          <w:sz w:val="21"/>
+        </w:rPr>
+        <w:t>) during freewheeling dead-time. Conduction can occur through the internal body diode or through the enhanced channel (Synchronous Rectification):</w:t>
       </w:r>
     </w:p>
-    <w:p>
-      <w:pPr>
-        <w:spacing w:before="160" w:after="80"/>
-      </w:pPr>
-      <w:r>
-        <w:rPr>
-          <w:b/>
-          <w:color w:val="4682B4"/>
-          <w:sz w:val="24"/>
-        </w:rPr>
-        <w:t>6. Thermal Network Junction Temperature Calculation:</w:t>
-      </w:r>
-    </w:p>
-    <w:p>
-      <w:pPr>
-        <w:spacing w:after="80"/>
-      </w:pPr>
-      <w:r>
-        <w:rPr>
-          <w:i/>
-          <w:color w:val="145AA0"/>
-          <w:sz w:val="21"/>
-        </w:rPr>
-      </w:r>
-      <w:r>
-        <w:rPr>
-          <w:color w:val="282C34"/>
-          <w:sz w:val="21"/>
-        </w:rPr>
-        <w:t>T_j = T_A + P_{TOTAL} \cdot (R_{\theta JC} + R_{\theta CS} + R_{\theta SA})</w:t>
-      </w:r>
-      <w:r>
-        <w:rPr>
-          <w:i/>
-          <w:color w:val="145AA0"/>
-          <w:sz w:val="21"/>
-        </w:rPr>
-      </w:r>
-    </w:p>
+    <w:tbl>
+      <w:tblPr>
+        <w:tblW w:type="auto" w:w="0"/>
+        <w:jc w:val="center"/>
+        <w:tblLook w:firstColumn="1" w:firstRow="1" w:lastColumn="0" w:lastRow="0" w:noHBand="0" w:noVBand="1" w:val="04A0"/>
+      </w:tblPr>
+      <w:tblGrid>
+        <w:gridCol w:w="9792"/>
+      </w:tblGrid>
+      <w:tr>
+        <w:tc>
+          <w:tcPr>
+            <w:tcW w:type="dxa" w:w="9792"/>
+            <w:shd w:fill="F5F6F8"/>
+            <w:tcMar>
+              <w:top w:w="80" w:type="dxa"/>
+              <w:bottom w:w="80" w:type="dxa"/>
+              <w:left w:w="140" w:type="dxa"/>
+              <w:right w:w="140" w:type="dxa"/>
+            </w:tcMar>
+            <w:tcBorders>
+              <w:left w:val="single" w:sz="18" w:space="0" w:color="CBD5E0"/>
+              <w:top w:val="none"/>
+              <w:right w:val="none"/>
+              <w:bottom w:val="none"/>
+            </w:tcBorders>
+          </w:tcPr>
+          <w:p>
+            <w:pPr>
+              <w:spacing w:line="240" w:lineRule="auto" w:after="0"/>
+            </w:pPr>
+            <w:r>
+              <w:rPr>
+                <w:rFonts w:ascii="Consolas" w:hAnsi="Consolas"/>
+                <w:color w:val="2D3748"/>
+                <w:sz w:val="18"/>
+              </w:rPr>
+              <w:t xml:space="preserve">               Quadrant III Conduction: Body Diode vs. Synchronous Rectifier</w:t>
+              <w:br/>
+              <w:t xml:space="preserve">         -Id (Reverse Current: Source to Drain)</w:t>
+              <w:br/>
+              <w:t xml:space="preserve">         ^</w:t>
+              <w:br/>
+              <w:t xml:space="preserve">         │               Channel Enhanced (Synchronous Rectifier: Vgs = 10V)</w:t>
+              <w:br/>
+              <w:t xml:space="preserve">         │               Ohmic conduction with NO diode knee: -Vds = -Id * Rds_on</w:t>
+              <w:br/>
+              <w:t xml:space="preserve">         │             .─'</w:t>
+              <w:br/>
+              <w:t xml:space="preserve">         │           .─'</w:t>
+              <w:br/>
+              <w:t xml:space="preserve">         │         .─'</w:t>
+              <w:br/>
+              <w:t xml:space="preserve">         │       .─'</w:t>
+              <w:br/>
+              <w:t xml:space="preserve">         │     .─'       Body Diode Conduction (Vgs = 0V: Inactive Gate)</w:t>
+              <w:br/>
+              <w:t xml:space="preserve">         │   .─'         Standard p-n junction forward knee: VF ~ 0.7V - 1.2V</w:t>
+              <w:br/>
+              <w:t xml:space="preserve">         │  /            Massive dead-time power loss!</w:t>
+              <w:br/>
+              <w:t xml:space="preserve">         │ /</w:t>
+              <w:br/>
+              <w:t xml:space="preserve">         │/</w:t>
+              <w:br/>
+              <w:t xml:space="preserve">         ├───────────────────────.</w:t>
+              <w:br/>
+              <w:t xml:space="preserve">         │                        \</w:t>
+              <w:br/>
+              <w:t xml:space="preserve">         │                         \</w:t>
+              <w:br/>
+              <w:t xml:space="preserve">         │                          \</w:t>
+              <w:br/>
+              <w:t xml:space="preserve">  -Vds ◄─┴───────────────────────────┴────── 0 (Drain-to-Source Voltage)</w:t>
+              <w:br/>
+              <w:t xml:space="preserve">                                    -VF (~0.8V)</w:t>
+            </w:r>
+          </w:p>
+        </w:tc>
+      </w:tr>
+    </w:tbl>
+    <w:p/>
     <w:p>
       <w:pPr>
         <w:pStyle w:val="ListBullet"/>
@@ -4216,18 +4744,33 @@
       </w:pPr>
       <w:r>
         <w:rPr>
+          <w:b/>
+          <w:color w:val="282C34"/>
+          <w:sz w:val="21"/>
+        </w:rPr>
+        <w:t>Body Diode Conduction ($V_{GS} = 0\,\text{V}$)</w:t>
+      </w:r>
+      <w:r>
+        <w:rPr>
+          <w:color w:val="282C34"/>
+          <w:sz w:val="21"/>
+        </w:rPr>
+        <w:t>: Current passes through the internal p-n body diode, creating a high forward drop (</w:t>
+      </w:r>
+      <w:r>
+        <w:rPr>
           <w:i/>
           <w:color w:val="145AA0"/>
           <w:sz w:val="21"/>
         </w:rPr>
-        <w:t>R_{\theta JC</w:t>
-      </w:r>
-      <w:r>
-        <w:rPr>
-          <w:color w:val="282C34"/>
-          <w:sz w:val="21"/>
-        </w:rPr>
-        <w:t>: Junction-to-case thermal resistance (</w:t>
+        <w:t>V_{SD \approx 0.8\,V \dots 1.2\,V</w:t>
+      </w:r>
+      <w:r>
+        <w:rPr>
+          <w:color w:val="282C34"/>
+          <w:sz w:val="21"/>
+        </w:rPr>
+        <w:t>). Stored minority carriers introduce severe reverse recovery loss (</w:t>
       </w:r>
       <w:r>
         <w:rPr>
@@ -4235,14 +4778,14 @@
           <w:color w:val="145AA0"/>
           <w:sz w:val="21"/>
         </w:rPr>
-        <w:t>^\circC/W</w:t>
-      </w:r>
-      <w:r>
-        <w:rPr>
-          <w:color w:val="282C34"/>
-          <w:sz w:val="21"/>
-        </w:rPr>
-        <w:t>, from datasheet)</w:t>
+        <w:t>Q_{rr</w:t>
+      </w:r>
+      <w:r>
+        <w:rPr>
+          <w:color w:val="282C34"/>
+          <w:sz w:val="21"/>
+        </w:rPr>
+        <w:t>).</w:t>
       </w:r>
     </w:p>
     <w:p>
@@ -4253,40 +4796,63 @@
       </w:pPr>
       <w:r>
         <w:rPr>
+          <w:b/>
+          <w:color w:val="282C34"/>
+          <w:sz w:val="21"/>
+        </w:rPr>
+        <w:t>Synchronous Rectification ($V_{GS} = +10\,\text{V}$)</w:t>
+      </w:r>
+      <w:r>
+        <w:rPr>
+          <w:color w:val="282C34"/>
+          <w:sz w:val="21"/>
+        </w:rPr>
+        <w:t xml:space="preserve">: When the channel is actively turned ON while current is flowing in reverse, current flows through the low-resistance majority-carrier channel. The voltage drop collapses to </w:t>
+      </w:r>
+      <w:r>
+        <w:rPr>
           <w:i/>
           <w:color w:val="145AA0"/>
           <w:sz w:val="21"/>
         </w:rPr>
-        <w:t>R_{\theta CS</w:t>
-      </w:r>
-      <w:r>
-        <w:rPr>
-          <w:color w:val="282C34"/>
-          <w:sz w:val="21"/>
-        </w:rPr>
-        <w:t>: Case-to-heatsink thermal interface resistance (thermal paste/sil-pad)</w:t>
-      </w:r>
-    </w:p>
-    <w:p>
-      <w:pPr>
-        <w:pStyle w:val="ListBullet"/>
-        <w:spacing w:after="40"/>
-        <w:ind w:left="360"/>
-      </w:pPr>
+        <w:t>-I_{D \cdot R_{DS(on)</w:t>
+      </w:r>
+      <w:r>
+        <w:rPr>
+          <w:color w:val="282C34"/>
+          <w:sz w:val="21"/>
+        </w:rPr>
+        <w:t xml:space="preserve"> (typically </w:t>
+      </w:r>
       <w:r>
         <w:rPr>
           <w:i/>
           <w:color w:val="145AA0"/>
           <w:sz w:val="21"/>
         </w:rPr>
-        <w:t>R_{\theta SA</w:t>
-      </w:r>
-      <w:r>
-        <w:rPr>
-          <w:color w:val="282C34"/>
-          <w:sz w:val="21"/>
-        </w:rPr>
-        <w:t>: Heatsink-to-ambient thermal resistance</w:t>
+        <w:t>&lt; 30\,mV</w:t>
+      </w:r>
+      <w:r>
+        <w:rPr>
+          <w:color w:val="282C34"/>
+          <w:sz w:val="21"/>
+        </w:rPr>
+        <w:t xml:space="preserve">), slashing freewheeling power loss by up to </w:t>
+      </w:r>
+      <w:r>
+        <w:rPr>
+          <w:i/>
+          <w:color w:val="145AA0"/>
+          <w:sz w:val="21"/>
+        </w:rPr>
+        <w:t>95\%</w:t>
+      </w:r>
+      <w:r>
+        <w:rPr>
+          <w:color w:val="282C34"/>
+          <w:sz w:val="21"/>
+        </w:rPr>
+        <w:t>.</w:t>
       </w:r>
     </w:p>
     <w:p>
@@ -4299,6 +4865,2450 @@
     </w:p>
     <w:p>
       <w:pPr>
+        <w:spacing w:before="160" w:after="80"/>
+      </w:pPr>
+      <w:r>
+        <w:rPr>
+          <w:b/>
+          <w:color w:val="4682B4"/>
+          <w:sz w:val="24"/>
+        </w:rPr>
+        <w:t>6.4 Fully-Synchronized Time-Domain Dynamic Switching Waveforms</w:t>
+      </w:r>
+    </w:p>
+    <w:p>
+      <w:pPr>
+        <w:spacing w:after="80"/>
+      </w:pPr>
+      <w:r>
+        <w:rPr>
+          <w:color w:val="282C34"/>
+          <w:sz w:val="21"/>
+        </w:rPr>
+        <w:t>During hard switching against an inductive load (e.g., in a Buck converter or motor inverter), the MOSFET traverses all operating regions in a tightly orchestrated sequence. Below is the complete cycle-accurate 5-channel oscilloscope waveform:</w:t>
+      </w:r>
+    </w:p>
+    <w:tbl>
+      <w:tblPr>
+        <w:tblW w:type="auto" w:w="0"/>
+        <w:jc w:val="center"/>
+        <w:tblLook w:firstColumn="1" w:firstRow="1" w:lastColumn="0" w:lastRow="0" w:noHBand="0" w:noVBand="1" w:val="04A0"/>
+      </w:tblPr>
+      <w:tblGrid>
+        <w:gridCol w:w="9792"/>
+      </w:tblGrid>
+      <w:tr>
+        <w:tc>
+          <w:tcPr>
+            <w:tcW w:type="dxa" w:w="9792"/>
+            <w:shd w:fill="F5F6F8"/>
+            <w:tcMar>
+              <w:top w:w="80" w:type="dxa"/>
+              <w:bottom w:w="80" w:type="dxa"/>
+              <w:left w:w="140" w:type="dxa"/>
+              <w:right w:w="140" w:type="dxa"/>
+            </w:tcMar>
+            <w:tcBorders>
+              <w:left w:val="single" w:sz="18" w:space="0" w:color="CBD5E0"/>
+              <w:top w:val="none"/>
+              <w:right w:val="none"/>
+              <w:bottom w:val="none"/>
+            </w:tcBorders>
+          </w:tcPr>
+          <w:p>
+            <w:pPr>
+              <w:spacing w:line="240" w:lineRule="auto" w:after="0"/>
+            </w:pPr>
+            <w:r>
+              <w:rPr>
+                <w:rFonts w:ascii="Consolas" w:hAnsi="Consolas"/>
+                <w:color w:val="2D3748"/>
+                <w:sz w:val="18"/>
+              </w:rPr>
+              <w:t xml:space="preserve">                       MOSFET Hard-Switching Dynamic Time-Domain Waveforms</w:t>
+              <w:br/>
+              <w:t xml:space="preserve">               │◄─ t_d(on) ─►│◄─ t_ri ─►│◄── t_vf ──►│◄─ t_enh ─►│       │◄─ t_d(off) ─►│◄── t_vr ──►│◄─ t_fi ─►│◄─ t_off ─►│</w:t>
+              <w:br/>
+              <w:t xml:space="preserve">               │   Phase 1   │  Phase 2 │   Phase 3  │  Phase 4  │       │    Phase 5   │   Phase 6  │  Phase 7 │  Phase 8  │</w:t>
+              <w:br/>
+              <w:t xml:space="preserve">  Vgs ^        │             │          │            │           │       │              │            │          │           │</w:t>
+              <w:br/>
+              <w:t xml:space="preserve">      │        │             │          │            │  V_drive  │       │   V_drive    │            │          │           │</w:t>
+              <w:br/>
+              <w:t xml:space="preserve"> V_drv┼────────┼─────────────┼──────────┼────────────┼──.────────┼───────┼──────────────┼────────────┼──────────┼───────────┤</w:t>
+              <w:br/>
+              <w:t xml:space="preserve">      │        │             │          │Miller Plat.│ /         │       │              │Miller Plat.│          │           │</w:t>
+              <w:br/>
+              <w:t xml:space="preserve"> V_plt┼────────┼─────────────┼──────────┼────────────┴'──────────┼───────┼──────────────┼────────────┴──────────┼───────────┤</w:t>
+              <w:br/>
+              <w:t xml:space="preserve">  V_th┼────────┼─────────────┼──────────/            │           │       │              │            \          │           │</w:t>
+              <w:br/>
+              <w:t xml:space="preserve">      │        │            .┼─────────'             │           │       │              │             \         │           │</w:t>
+              <w:br/>
+              <w:t xml:space="preserve">   0V ┴────────┴───────────'─┴───────────────────────┴───────────┴───────┴──────────────┴──────────────\────────┴───────────┴──&gt; Time</w:t>
+              <w:br/>
+              <w:t xml:space="preserve">               │             │          │            │           │       │              │               '───────.             │</w:t>
+              <w:br/>
+              <w:t xml:space="preserve">  Ig  ^        │             │          │            │           │       │              │                       │             │</w:t>
+              <w:br/>
+              <w:t xml:space="preserve">      │        │  Ig_source  │          │            │           │       │              │                       │             │</w:t>
+              <w:br/>
+              <w:t xml:space="preserve"> +I_pk┼────────┼──.──────────┼──────────┼────────────┼───────────┼───────┼──────────────┼───────────────────────┼─────────────┤</w:t>
+              <w:br/>
+              <w:t xml:space="preserve">      │        │ / \         │          │            │           │       │              │                       │             │</w:t>
+              <w:br/>
+              <w:t xml:space="preserve">   0A ┼────────┴'───\────────┴──────────┴────────────┴───.───────┼───────┼──────────────┴───────────────────────┴──.──────────┤</w:t>
+              <w:br/>
+              <w:t xml:space="preserve">      │        │     '──────────────────────────────────'        │       │                                         / \        │</w:t>
+              <w:br/>
+              <w:t xml:space="preserve"> -I_pk┼────────┼─────────────┼──────────┼────────────┼───────────┼───────┼──.─────────────────────────────────────'───\───────┤</w:t>
+              <w:br/>
+              <w:t xml:space="preserve">      │        │             │          │            │           │       │   \ Ig_sink                                 '──────┤</w:t>
+              <w:br/>
+              <w:t xml:space="preserve">      │        │             │          │            │           │       │    '                                               │</w:t>
+              <w:br/>
+              <w:t xml:space="preserve">  Vds ^        │             │          │            │           │       │              │   V_spike  │          │           │</w:t>
+              <w:br/>
+              <w:t xml:space="preserve">      │        │    V_bus    │  V_bus   │            │           │       │              │   (L*di/dt)│          │           │</w:t>
+              <w:br/>
+              <w:t xml:space="preserve"> V_bus┼────────┼─────────────┼──────────┼────────────┼───────────┼───────┼──────────────┼─────.──────┼──────────┼─────.─────┤</w:t>
+              <w:br/>
+              <w:t xml:space="preserve">      │        │             │          │\           │           │       │              │    / \     │          │    / \    │</w:t>
+              <w:br/>
+              <w:t xml:space="preserve">      │        │             │          │ \          │           │       │              │   /   '────┼──────────┼───'   \   │</w:t>
+              <w:br/>
+              <w:t xml:space="preserve">   0V ┴────────┴─────────────┴──────────┴──'─────────┴───.───────┴───────┴──────────────┴──'────────┴──────────┴────────'───┴──&gt; Time</w:t>
+              <w:br/>
+              <w:t xml:space="preserve">               │             │          │                 Rds*Id │       │              │ Rds*Id     │          │           │</w:t>
+              <w:br/>
+              <w:t xml:space="preserve">  Id  ^        │             │          │            │           │       │              │            │          │           │</w:t>
+              <w:br/>
+              <w:t xml:space="preserve">      │        │             │  I_rr    │            │           │       │              │            │          │           │</w:t>
+              <w:br/>
+              <w:t xml:space="preserve"> I_ovr┼────────┼─────────────┼───.──────┼────────────┼───────────┼───────┼──────────────┼────────────┼──────────┼───────────┤</w:t>
+              <w:br/>
+              <w:t xml:space="preserve">      │        │             │  / \     │            │           │       │              │            │          │           │</w:t>
+              <w:br/>
+              <w:t>I_load┼────────┼─────────────┼─'───\────┼────────────┼───────────┼───────┼──────────────┼────────────┼──────────┼───────────┤</w:t>
+              <w:br/>
+              <w:t xml:space="preserve">      │        │             │/     '───┴────────────┴───────────┼───────┼──────────────┴────────────┼──────────┼───────────┤</w:t>
+              <w:br/>
+              <w:t xml:space="preserve">      │        │             /          │            │           │       │              │            │\         │           │</w:t>
+              <w:br/>
+              <w:t xml:space="preserve">   0A ┴────────┴────────────'┴──────────┴────────────┴───────────┴───────┴──────────────┴────────────┴─'────────┴───────────┴──&gt; Time</w:t>
+              <w:br/>
+              <w:t xml:space="preserve">               │             │          │            │           │       │              │            │          │           │</w:t>
+              <w:br/>
+              <w:t xml:space="preserve">  P(t)^        │             │          │            │           │       │              │            │          │           │</w:t>
+              <w:br/>
+              <w:t xml:space="preserve">      │        │             │          │  P_sw(on)  │           │       │              │            │ P_sw(off)│           │</w:t>
+              <w:br/>
+              <w:t xml:space="preserve"> P_max┼────────┼─────────────┼──────────┼─────.──────┼───────────┼───────┼──────────────┼────────────┼─────.────┼───────────┤</w:t>
+              <w:br/>
+              <w:t xml:space="preserve">      │        │             │          │    / \     │           │       │              │            │    / \   │           │</w:t>
+              <w:br/>
+              <w:t xml:space="preserve">      │        │             │          │   /   \    │ P_cond    │       │   P_cond     │            │   /   \  │           │</w:t>
+              <w:br/>
+              <w:t xml:space="preserve">   0W ┴────────┴─────────────┴──────────┴──'─────'───┴───.───────┴───────┴───.──────────┴────────────┴──'─────'─┴───────────┴──&gt; Time</w:t>
+              <w:br/>
+              <w:t xml:space="preserve">               │             │          │            │   Rds*Id^2│       │    Rds*Id^2  │            │          │           │</w:t>
+              <w:br/>
+              <w:t>───────────────┼─────────────┼──────────┼────────────┼───────────┼───────┼──────────────┼────────────┼──────────┼───────────┤</w:t>
+              <w:br/>
+              <w:t>OPERATING      │  1. CUTOFF  │ 2.ACTIVE │ 3.ACTIVE-&gt; │ 4. LINEAR │       │  5. LINEAR   │ 6. ACTIVE  │ 7.ACTIVE │ 8. CUTOFF │</w:t>
+              <w:br/>
+              <w:t>REGION:        │   REGION    │(SATURAT.)│   LINEAR   │  (OHMIC)  │       │ (DESATURAT.) │ (SATURAT.) │ (SATUR.) │  REGION   │</w:t>
+              <w:br/>
+              <w:t>───────────────┴─────────────┴──────────┴────────────┴───────────┴───────┴──────────────┴────────────┴──────────┴───────────┘</w:t>
+            </w:r>
+          </w:p>
+        </w:tc>
+      </w:tr>
+    </w:tbl>
+    <w:p/>
+    <w:p>
+      <w:pPr>
+        <w:spacing w:before="120" w:after="40"/>
+      </w:pPr>
+      <w:r>
+        <w:rPr>
+          <w:b/>
+          <w:color w:val="282C34"/>
+          <w:sz w:val="22"/>
+        </w:rPr>
+        <w:t>Detailed Phase-by-Phase Operation &amp; Region Mapping:</w:t>
+      </w:r>
+    </w:p>
+    <w:p>
+      <w:pPr>
+        <w:spacing w:after="80"/>
+      </w:pPr>
+      <w:r>
+        <w:rPr>
+          <w:color w:val="282C34"/>
+          <w:sz w:val="21"/>
+        </w:rPr>
+        <w:t>##### Turn-On Transient:</w:t>
+      </w:r>
+    </w:p>
+    <w:p>
+      <w:pPr>
+        <w:pStyle w:val="ListBullet"/>
+        <w:spacing w:after="40"/>
+        <w:ind w:left="360"/>
+      </w:pPr>
+      <w:r>
+        <w:rPr>
+          <w:b/>
+          <w:color w:val="282C34"/>
+          <w:sz w:val="21"/>
+        </w:rPr>
+        <w:t>Phase 1: Turn-On Delay ($t_{d(on)}$) — Operating Region: CUTOFF</w:t>
+      </w:r>
+      <w:r>
+        <w:rPr>
+          <w:color w:val="282C34"/>
+          <w:sz w:val="21"/>
+        </w:rPr>
+        <w:t>:</w:t>
+      </w:r>
+    </w:p>
+    <w:p>
+      <w:pPr>
+        <w:pStyle w:val="ListBullet"/>
+        <w:spacing w:after="40"/>
+        <w:ind w:left="720"/>
+      </w:pPr>
+      <w:r>
+        <w:rPr>
+          <w:color w:val="282C34"/>
+          <w:sz w:val="21"/>
+        </w:rPr>
+        <w:t xml:space="preserve">Gate driver applies </w:t>
+      </w:r>
+      <w:r>
+        <w:rPr>
+          <w:i/>
+          <w:color w:val="145AA0"/>
+          <w:sz w:val="21"/>
+        </w:rPr>
+        <w:t>+V_{DRV</w:t>
+      </w:r>
+      <w:r>
+        <w:rPr>
+          <w:color w:val="282C34"/>
+          <w:sz w:val="21"/>
+        </w:rPr>
+        <w:t xml:space="preserve">. Gate current </w:t>
+      </w:r>
+      <w:r>
+        <w:rPr>
+          <w:i/>
+          <w:color w:val="145AA0"/>
+          <w:sz w:val="21"/>
+        </w:rPr>
+        <w:t>I_G</w:t>
+      </w:r>
+      <w:r>
+        <w:rPr>
+          <w:color w:val="282C34"/>
+          <w:sz w:val="21"/>
+        </w:rPr>
+        <w:t xml:space="preserve"> surges into </w:t>
+      </w:r>
+      <w:r>
+        <w:rPr>
+          <w:i/>
+          <w:color w:val="145AA0"/>
+          <w:sz w:val="21"/>
+        </w:rPr>
+        <w:t>C_{iss</w:t>
+      </w:r>
+      <w:r>
+        <w:rPr>
+          <w:color w:val="282C34"/>
+          <w:sz w:val="21"/>
+        </w:rPr>
+        <w:t>.</w:t>
+      </w:r>
+    </w:p>
+    <w:p>
+      <w:pPr>
+        <w:pStyle w:val="ListBullet"/>
+        <w:spacing w:after="40"/>
+        <w:ind w:left="720"/>
+      </w:pPr>
+      <w:r>
+        <w:rPr>
+          <w:i/>
+          <w:color w:val="145AA0"/>
+          <w:sz w:val="21"/>
+        </w:rPr>
+        <w:t>V_{GS</w:t>
+      </w:r>
+      <w:r>
+        <w:rPr>
+          <w:color w:val="282C34"/>
+          <w:sz w:val="21"/>
+        </w:rPr>
+        <w:t xml:space="preserve"> charges exponentially from </w:t>
+      </w:r>
+      <w:r>
+        <w:rPr>
+          <w:i/>
+          <w:color w:val="145AA0"/>
+          <w:sz w:val="21"/>
+        </w:rPr>
+        <w:t>0\,V</w:t>
+      </w:r>
+      <w:r>
+        <w:rPr>
+          <w:color w:val="282C34"/>
+          <w:sz w:val="21"/>
+        </w:rPr>
+        <w:t xml:space="preserve"> up to </w:t>
+      </w:r>
+      <w:r>
+        <w:rPr>
+          <w:i/>
+          <w:color w:val="145AA0"/>
+          <w:sz w:val="21"/>
+        </w:rPr>
+        <w:t>V_{TH</w:t>
+      </w:r>
+      <w:r>
+        <w:rPr>
+          <w:color w:val="282C34"/>
+          <w:sz w:val="21"/>
+        </w:rPr>
+        <w:t>.</w:t>
+      </w:r>
+    </w:p>
+    <w:p>
+      <w:pPr>
+        <w:pStyle w:val="ListBullet"/>
+        <w:spacing w:after="40"/>
+        <w:ind w:left="720"/>
+      </w:pPr>
+      <w:r>
+        <w:rPr>
+          <w:color w:val="282C34"/>
+          <w:sz w:val="21"/>
+        </w:rPr>
+        <w:t xml:space="preserve">Because </w:t>
+      </w:r>
+      <w:r>
+        <w:rPr>
+          <w:i/>
+          <w:color w:val="145AA0"/>
+          <w:sz w:val="21"/>
+        </w:rPr>
+        <w:t>V_{GS &lt; V_{TH</w:t>
+      </w:r>
+      <w:r>
+        <w:rPr>
+          <w:color w:val="282C34"/>
+          <w:sz w:val="21"/>
+        </w:rPr>
+        <w:t xml:space="preserve">, no channel exists: </w:t>
+      </w:r>
+      <w:r>
+        <w:rPr>
+          <w:i/>
+          <w:color w:val="145AA0"/>
+          <w:sz w:val="21"/>
+        </w:rPr>
+        <w:t>I_D = 0</w:t>
+      </w:r>
+      <w:r>
+        <w:rPr>
+          <w:color w:val="282C34"/>
+          <w:sz w:val="21"/>
+        </w:rPr>
+        <w:t xml:space="preserve"> and </w:t>
+      </w:r>
+      <w:r>
+        <w:rPr>
+          <w:i/>
+          <w:color w:val="145AA0"/>
+          <w:sz w:val="21"/>
+        </w:rPr>
+        <w:t>V_{DS = V_{BUS</w:t>
+      </w:r>
+      <w:r>
+        <w:rPr>
+          <w:color w:val="282C34"/>
+          <w:sz w:val="21"/>
+        </w:rPr>
+        <w:t>. Power loss is zero.</w:t>
+      </w:r>
+    </w:p>
+    <w:p>
+      <w:pPr>
+        <w:pStyle w:val="ListBullet"/>
+        <w:spacing w:after="40"/>
+        <w:ind w:left="360"/>
+      </w:pPr>
+      <w:r>
+        <w:rPr>
+          <w:b/>
+          <w:color w:val="282C34"/>
+          <w:sz w:val="21"/>
+        </w:rPr>
+        <w:t>Phase 2: Current Rise Time ($t_{ri}$) — Operating Region: SATURATION (ACTIVE)</w:t>
+      </w:r>
+      <w:r>
+        <w:rPr>
+          <w:color w:val="282C34"/>
+          <w:sz w:val="21"/>
+        </w:rPr>
+        <w:t>:</w:t>
+      </w:r>
+    </w:p>
+    <w:p>
+      <w:pPr>
+        <w:pStyle w:val="ListBullet"/>
+        <w:spacing w:after="40"/>
+        <w:ind w:left="720"/>
+      </w:pPr>
+      <w:r>
+        <w:rPr>
+          <w:i/>
+          <w:color w:val="145AA0"/>
+          <w:sz w:val="21"/>
+        </w:rPr>
+        <w:t>V_{GS</w:t>
+      </w:r>
+      <w:r>
+        <w:rPr>
+          <w:color w:val="282C34"/>
+          <w:sz w:val="21"/>
+        </w:rPr>
+        <w:t xml:space="preserve"> surpasses </w:t>
+      </w:r>
+      <w:r>
+        <w:rPr>
+          <w:i/>
+          <w:color w:val="145AA0"/>
+          <w:sz w:val="21"/>
+        </w:rPr>
+        <w:t>V_{TH</w:t>
+      </w:r>
+      <w:r>
+        <w:rPr>
+          <w:color w:val="282C34"/>
+          <w:sz w:val="21"/>
+        </w:rPr>
+        <w:t xml:space="preserve"> and rises toward </w:t>
+      </w:r>
+      <w:r>
+        <w:rPr>
+          <w:i/>
+          <w:color w:val="145AA0"/>
+          <w:sz w:val="21"/>
+        </w:rPr>
+        <w:t>V_{plateau</w:t>
+      </w:r>
+      <w:r>
+        <w:rPr>
+          <w:color w:val="282C34"/>
+          <w:sz w:val="21"/>
+        </w:rPr>
+        <w:t>.</w:t>
+      </w:r>
+    </w:p>
+    <w:p>
+      <w:pPr>
+        <w:pStyle w:val="ListBullet"/>
+        <w:spacing w:after="40"/>
+        <w:ind w:left="720"/>
+      </w:pPr>
+      <w:r>
+        <w:rPr>
+          <w:color w:val="282C34"/>
+          <w:sz w:val="21"/>
+        </w:rPr>
+        <w:t xml:space="preserve">The channel opens and operates in the </w:t>
+      </w:r>
+      <w:r>
+        <w:rPr>
+          <w:b/>
+          <w:color w:val="282C34"/>
+          <w:sz w:val="21"/>
+        </w:rPr>
+        <w:t>Saturation Region</w:t>
+      </w:r>
+      <w:r>
+        <w:rPr>
+          <w:color w:val="282C34"/>
+          <w:sz w:val="21"/>
+        </w:rPr>
+        <w:t xml:space="preserve"> (</w:t>
+      </w:r>
+      <w:r>
+        <w:rPr>
+          <w:i/>
+          <w:color w:val="145AA0"/>
+          <w:sz w:val="21"/>
+        </w:rPr>
+        <w:t>V_{DS ≥ V_{GS - V_{TH</w:t>
+      </w:r>
+      <w:r>
+        <w:rPr>
+          <w:color w:val="282C34"/>
+          <w:sz w:val="21"/>
+        </w:rPr>
+        <w:t>).</w:t>
+      </w:r>
+    </w:p>
+    <w:p>
+      <w:pPr>
+        <w:pStyle w:val="ListBullet"/>
+        <w:spacing w:after="40"/>
+        <w:ind w:left="720"/>
+      </w:pPr>
+      <w:r>
+        <w:rPr>
+          <w:i/>
+          <w:color w:val="145AA0"/>
+          <w:sz w:val="21"/>
+        </w:rPr>
+        <w:t>I_D</w:t>
+      </w:r>
+      <w:r>
+        <w:rPr>
+          <w:color w:val="282C34"/>
+          <w:sz w:val="21"/>
+        </w:rPr>
+        <w:t xml:space="preserve"> ramps up rapidly from </w:t>
+      </w:r>
+      <w:r>
+        <w:rPr>
+          <w:i/>
+          <w:color w:val="145AA0"/>
+          <w:sz w:val="21"/>
+        </w:rPr>
+        <w:t>0</w:t>
+      </w:r>
+      <w:r>
+        <w:rPr>
+          <w:color w:val="282C34"/>
+          <w:sz w:val="21"/>
+        </w:rPr>
+        <w:t xml:space="preserve"> to full load current </w:t>
+      </w:r>
+      <w:r>
+        <w:rPr>
+          <w:i/>
+          <w:color w:val="145AA0"/>
+          <w:sz w:val="21"/>
+        </w:rPr>
+        <w:t>I_{LOAD</w:t>
+      </w:r>
+      <w:r>
+        <w:rPr>
+          <w:color w:val="282C34"/>
+          <w:sz w:val="21"/>
+        </w:rPr>
+        <w:t>.</w:t>
+      </w:r>
+    </w:p>
+    <w:p>
+      <w:pPr>
+        <w:pStyle w:val="ListBullet"/>
+        <w:spacing w:after="40"/>
+        <w:ind w:left="720"/>
+      </w:pPr>
+      <w:r>
+        <w:rPr>
+          <w:color w:val="282C34"/>
+          <w:sz w:val="21"/>
+        </w:rPr>
+        <w:t xml:space="preserve">If commutating against an inductive freewheeling diode, </w:t>
+      </w:r>
+      <w:r>
+        <w:rPr>
+          <w:i/>
+          <w:color w:val="145AA0"/>
+          <w:sz w:val="21"/>
+        </w:rPr>
+        <w:t>I_D</w:t>
+      </w:r>
+      <w:r>
+        <w:rPr>
+          <w:color w:val="282C34"/>
+          <w:sz w:val="21"/>
+        </w:rPr>
+        <w:t xml:space="preserve"> overshoots by </w:t>
+      </w:r>
+      <w:r>
+        <w:rPr>
+          <w:i/>
+          <w:color w:val="145AA0"/>
+          <w:sz w:val="21"/>
+        </w:rPr>
+        <w:t>I_{rr</w:t>
+      </w:r>
+      <w:r>
+        <w:rPr>
+          <w:color w:val="282C34"/>
+          <w:sz w:val="21"/>
+        </w:rPr>
+        <w:t xml:space="preserve"> (diode reverse recovery current).</w:t>
+      </w:r>
+    </w:p>
+    <w:p>
+      <w:pPr>
+        <w:pStyle w:val="ListBullet"/>
+        <w:spacing w:after="40"/>
+        <w:ind w:left="720"/>
+      </w:pPr>
+      <w:r>
+        <w:rPr>
+          <w:i/>
+          <w:color w:val="145AA0"/>
+          <w:sz w:val="21"/>
+        </w:rPr>
+        <w:t>V_{DS</w:t>
+      </w:r>
+      <w:r>
+        <w:rPr>
+          <w:color w:val="282C34"/>
+          <w:sz w:val="21"/>
+        </w:rPr>
+        <w:t xml:space="preserve"> remains clamped at the full DC bus voltage (</w:t>
+      </w:r>
+      <w:r>
+        <w:rPr>
+          <w:i/>
+          <w:color w:val="145AA0"/>
+          <w:sz w:val="21"/>
+        </w:rPr>
+        <w:t>V_{BUS</w:t>
+      </w:r>
+      <w:r>
+        <w:rPr>
+          <w:color w:val="282C34"/>
+          <w:sz w:val="21"/>
+        </w:rPr>
+        <w:t>) by the external freewheeling diode.</w:t>
+      </w:r>
+    </w:p>
+    <w:p>
+      <w:pPr>
+        <w:pStyle w:val="ListBullet"/>
+        <w:spacing w:after="40"/>
+        <w:ind w:left="360"/>
+      </w:pPr>
+      <w:r>
+        <w:rPr>
+          <w:b/>
+          <w:color w:val="282C34"/>
+          <w:sz w:val="21"/>
+        </w:rPr>
+        <w:t>Phase 3: Voltage Fall / Miller Plateau ($t_{vf}$) — Operating Region: SATURATION $\rightarrow$ LINEAR TRANSITION</w:t>
+      </w:r>
+      <w:r>
+        <w:rPr>
+          <w:color w:val="282C34"/>
+          <w:sz w:val="21"/>
+        </w:rPr>
+        <w:t>:</w:t>
+      </w:r>
+    </w:p>
+    <w:p>
+      <w:pPr>
+        <w:pStyle w:val="ListBullet"/>
+        <w:spacing w:after="40"/>
+        <w:ind w:left="720"/>
+      </w:pPr>
+      <w:r>
+        <w:rPr>
+          <w:color w:val="282C34"/>
+          <w:sz w:val="21"/>
+        </w:rPr>
+        <w:t xml:space="preserve">Once </w:t>
+      </w:r>
+      <w:r>
+        <w:rPr>
+          <w:i/>
+          <w:color w:val="145AA0"/>
+          <w:sz w:val="21"/>
+        </w:rPr>
+        <w:t>I_D</w:t>
+      </w:r>
+      <w:r>
+        <w:rPr>
+          <w:color w:val="282C34"/>
+          <w:sz w:val="21"/>
+        </w:rPr>
+        <w:t xml:space="preserve"> reaches full load current, the freewheeling diode turns OFF.</w:t>
+      </w:r>
+    </w:p>
+    <w:p>
+      <w:pPr>
+        <w:pStyle w:val="ListBullet"/>
+        <w:spacing w:after="40"/>
+        <w:ind w:left="720"/>
+      </w:pPr>
+      <w:r>
+        <w:rPr>
+          <w:color w:val="282C34"/>
+          <w:sz w:val="21"/>
+        </w:rPr>
+        <w:t xml:space="preserve">The drain voltage </w:t>
+      </w:r>
+      <w:r>
+        <w:rPr>
+          <w:i/>
+          <w:color w:val="145AA0"/>
+          <w:sz w:val="21"/>
+        </w:rPr>
+        <w:t>V_{DS</w:t>
+      </w:r>
+      <w:r>
+        <w:rPr>
+          <w:color w:val="282C34"/>
+          <w:sz w:val="21"/>
+        </w:rPr>
+        <w:t xml:space="preserve"> begins to collapse violently from </w:t>
+      </w:r>
+      <w:r>
+        <w:rPr>
+          <w:i/>
+          <w:color w:val="145AA0"/>
+          <w:sz w:val="21"/>
+        </w:rPr>
+        <w:t>V_{BUS</w:t>
+      </w:r>
+      <w:r>
+        <w:rPr>
+          <w:color w:val="282C34"/>
+          <w:sz w:val="21"/>
+        </w:rPr>
+        <w:t xml:space="preserve"> toward zero.</w:t>
+      </w:r>
+    </w:p>
+    <w:p>
+      <w:pPr>
+        <w:pStyle w:val="ListBullet"/>
+        <w:spacing w:after="40"/>
+        <w:ind w:left="720"/>
+      </w:pPr>
+      <w:r>
+        <w:rPr>
+          <w:color w:val="282C34"/>
+          <w:sz w:val="21"/>
+        </w:rPr>
+        <w:t xml:space="preserve">Due to the massive negative </w:t>
+      </w:r>
+      <w:r>
+        <w:rPr>
+          <w:i/>
+          <w:color w:val="145AA0"/>
+          <w:sz w:val="21"/>
+        </w:rPr>
+        <w:t>\frac{dV_{DS{dt</w:t>
+      </w:r>
+      <w:r>
+        <w:rPr>
+          <w:color w:val="282C34"/>
+          <w:sz w:val="21"/>
+        </w:rPr>
+        <w:t xml:space="preserve">, all gate drive current is diverted into discharging the Miller capacitance </w:t>
+      </w:r>
+      <w:r>
+        <w:rPr>
+          <w:i/>
+          <w:color w:val="145AA0"/>
+          <w:sz w:val="21"/>
+        </w:rPr>
+        <w:t>C_{gd</w:t>
+      </w:r>
+      <w:r>
+        <w:rPr>
+          <w:color w:val="282C34"/>
+          <w:sz w:val="21"/>
+        </w:rPr>
+        <w:t>:</w:t>
+      </w:r>
+    </w:p>
+    <w:p>
+      <w:pPr>
+        <w:spacing w:after="80"/>
+      </w:pPr>
+      <w:r>
+        <w:rPr>
+          <w:i/>
+          <w:color w:val="145AA0"/>
+          <w:sz w:val="21"/>
+        </w:rPr>
+      </w:r>
+      <w:r>
+        <w:rPr>
+          <w:color w:val="282C34"/>
+          <w:sz w:val="21"/>
+        </w:rPr>
+        <w:t>I_G = C_{gd} \cdot \frac{dV_{DS}}{dt}</w:t>
+      </w:r>
+      <w:r>
+        <w:rPr>
+          <w:i/>
+          <w:color w:val="145AA0"/>
+          <w:sz w:val="21"/>
+        </w:rPr>
+      </w:r>
+    </w:p>
+    <w:p>
+      <w:pPr>
+        <w:pStyle w:val="ListBullet"/>
+        <w:spacing w:after="40"/>
+        <w:ind w:left="720"/>
+      </w:pPr>
+      <w:r>
+        <w:rPr>
+          <w:i/>
+          <w:color w:val="145AA0"/>
+          <w:sz w:val="21"/>
+        </w:rPr>
+        <w:t>V_{GS</w:t>
+      </w:r>
+      <w:r>
+        <w:rPr>
+          <w:color w:val="282C34"/>
+          <w:sz w:val="21"/>
+        </w:rPr>
+        <w:t xml:space="preserve"> is clamped flat at the </w:t>
+      </w:r>
+      <w:r>
+        <w:rPr>
+          <w:b/>
+          <w:color w:val="282C34"/>
+          <w:sz w:val="21"/>
+        </w:rPr>
+        <w:t>Miller Plateau Voltage ($V_{plateau}$)</w:t>
+      </w:r>
+      <w:r>
+        <w:rPr>
+          <w:color w:val="282C34"/>
+          <w:sz w:val="21"/>
+        </w:rPr>
+        <w:t>:</w:t>
+      </w:r>
+    </w:p>
+    <w:p>
+      <w:pPr>
+        <w:spacing w:after="80"/>
+      </w:pPr>
+      <w:r>
+        <w:rPr>
+          <w:i/>
+          <w:color w:val="145AA0"/>
+          <w:sz w:val="21"/>
+        </w:rPr>
+      </w:r>
+      <w:r>
+        <w:rPr>
+          <w:color w:val="282C34"/>
+          <w:sz w:val="21"/>
+        </w:rPr>
+        <w:t>V_{plateau} = V_{TH} + \frac{I_{LOAD}}{g_m}</w:t>
+      </w:r>
+      <w:r>
+        <w:rPr>
+          <w:i/>
+          <w:color w:val="145AA0"/>
+          <w:sz w:val="21"/>
+        </w:rPr>
+      </w:r>
+    </w:p>
+    <w:p>
+      <w:pPr>
+        <w:pStyle w:val="ListBullet"/>
+        <w:spacing w:after="40"/>
+        <w:ind w:left="720"/>
+      </w:pPr>
+      <w:r>
+        <w:rPr>
+          <w:color w:val="282C34"/>
+          <w:sz w:val="21"/>
+        </w:rPr>
+        <w:t>The device traverses from the edge of Saturation into the Linear region.</w:t>
+      </w:r>
+    </w:p>
+    <w:p>
+      <w:pPr>
+        <w:pStyle w:val="ListBullet"/>
+        <w:spacing w:after="40"/>
+        <w:ind w:left="720"/>
+      </w:pPr>
+      <w:r>
+        <w:rPr>
+          <w:b/>
+          <w:color w:val="282C34"/>
+          <w:sz w:val="21"/>
+        </w:rPr>
+        <w:t>Peak Turn-On Power Loss ($P_{sw(on)}$)</w:t>
+      </w:r>
+      <w:r>
+        <w:rPr>
+          <w:color w:val="282C34"/>
+          <w:sz w:val="21"/>
+        </w:rPr>
+        <w:t xml:space="preserve"> occurs here because both </w:t>
+      </w:r>
+      <w:r>
+        <w:rPr>
+          <w:i/>
+          <w:color w:val="145AA0"/>
+          <w:sz w:val="21"/>
+        </w:rPr>
+        <w:t>V_{DS</w:t>
+      </w:r>
+      <w:r>
+        <w:rPr>
+          <w:color w:val="282C34"/>
+          <w:sz w:val="21"/>
+        </w:rPr>
+        <w:t xml:space="preserve"> and </w:t>
+      </w:r>
+      <w:r>
+        <w:rPr>
+          <w:i/>
+          <w:color w:val="145AA0"/>
+          <w:sz w:val="21"/>
+        </w:rPr>
+        <w:t>I_D</w:t>
+      </w:r>
+      <w:r>
+        <w:rPr>
+          <w:color w:val="282C34"/>
+          <w:sz w:val="21"/>
+        </w:rPr>
+        <w:t xml:space="preserve"> are simultaneously high!</w:t>
+      </w:r>
+    </w:p>
+    <w:p>
+      <w:pPr>
+        <w:pStyle w:val="ListBullet"/>
+        <w:spacing w:after="40"/>
+        <w:ind w:left="360"/>
+      </w:pPr>
+      <w:r>
+        <w:rPr>
+          <w:b/>
+          <w:color w:val="282C34"/>
+          <w:sz w:val="21"/>
+        </w:rPr>
+        <w:t>Phase 4: Channel Enhancement ($t_{enh}$) — Operating Region: DEEP LINEAR (OHMIC)</w:t>
+      </w:r>
+      <w:r>
+        <w:rPr>
+          <w:color w:val="282C34"/>
+          <w:sz w:val="21"/>
+        </w:rPr>
+        <w:t>:</w:t>
+      </w:r>
+    </w:p>
+    <w:p>
+      <w:pPr>
+        <w:pStyle w:val="ListBullet"/>
+        <w:spacing w:after="40"/>
+        <w:ind w:left="720"/>
+      </w:pPr>
+      <w:r>
+        <w:rPr>
+          <w:i/>
+          <w:color w:val="145AA0"/>
+          <w:sz w:val="21"/>
+        </w:rPr>
+        <w:t>V_{DS</w:t>
+      </w:r>
+      <w:r>
+        <w:rPr>
+          <w:color w:val="282C34"/>
+          <w:sz w:val="21"/>
+        </w:rPr>
+        <w:t xml:space="preserve"> has fallen to the ohmic conduction drop (</w:t>
+      </w:r>
+      <w:r>
+        <w:rPr>
+          <w:i/>
+          <w:color w:val="145AA0"/>
+          <w:sz w:val="21"/>
+        </w:rPr>
+        <w:t>I_D \cdot R_{DS(on)</w:t>
+      </w:r>
+      <w:r>
+        <w:rPr>
+          <w:color w:val="282C34"/>
+          <w:sz w:val="21"/>
+        </w:rPr>
+        <w:t>).</w:t>
+      </w:r>
+    </w:p>
+    <w:p>
+      <w:pPr>
+        <w:pStyle w:val="ListBullet"/>
+        <w:spacing w:after="40"/>
+        <w:ind w:left="720"/>
+      </w:pPr>
+      <w:r>
+        <w:rPr>
+          <w:color w:val="282C34"/>
+          <w:sz w:val="21"/>
+        </w:rPr>
+        <w:t xml:space="preserve">Gate current resumes charging </w:t>
+      </w:r>
+      <w:r>
+        <w:rPr>
+          <w:i/>
+          <w:color w:val="145AA0"/>
+          <w:sz w:val="21"/>
+        </w:rPr>
+        <w:t>C_{gs</w:t>
+      </w:r>
+      <w:r>
+        <w:rPr>
+          <w:color w:val="282C34"/>
+          <w:sz w:val="21"/>
+        </w:rPr>
+        <w:t xml:space="preserve"> and </w:t>
+      </w:r>
+      <w:r>
+        <w:rPr>
+          <w:i/>
+          <w:color w:val="145AA0"/>
+          <w:sz w:val="21"/>
+        </w:rPr>
+        <w:t>C_{gd</w:t>
+      </w:r>
+      <w:r>
+        <w:rPr>
+          <w:color w:val="282C34"/>
+          <w:sz w:val="21"/>
+        </w:rPr>
+        <w:t xml:space="preserve"> from </w:t>
+      </w:r>
+      <w:r>
+        <w:rPr>
+          <w:i/>
+          <w:color w:val="145AA0"/>
+          <w:sz w:val="21"/>
+        </w:rPr>
+        <w:t>V_{plateau</w:t>
+      </w:r>
+      <w:r>
+        <w:rPr>
+          <w:color w:val="282C34"/>
+          <w:sz w:val="21"/>
+        </w:rPr>
+        <w:t xml:space="preserve"> up to full gate drive voltage (</w:t>
+      </w:r>
+      <w:r>
+        <w:rPr>
+          <w:i/>
+          <w:color w:val="145AA0"/>
+          <w:sz w:val="21"/>
+        </w:rPr>
+        <w:t>V_{DRIVE = 10\,V \dots 15\,V</w:t>
+      </w:r>
+      <w:r>
+        <w:rPr>
+          <w:color w:val="282C34"/>
+          <w:sz w:val="21"/>
+        </w:rPr>
+        <w:t>).</w:t>
+      </w:r>
+    </w:p>
+    <w:p>
+      <w:pPr>
+        <w:pStyle w:val="ListBullet"/>
+        <w:spacing w:after="40"/>
+        <w:ind w:left="720"/>
+      </w:pPr>
+      <w:r>
+        <w:rPr>
+          <w:color w:val="282C34"/>
+          <w:sz w:val="21"/>
+        </w:rPr>
+        <w:t xml:space="preserve">The channel enters deep ohmic conduction; </w:t>
+      </w:r>
+      <w:r>
+        <w:rPr>
+          <w:i/>
+          <w:color w:val="145AA0"/>
+          <w:sz w:val="21"/>
+        </w:rPr>
+        <w:t>R_{DS(on)</w:t>
+      </w:r>
+      <w:r>
+        <w:rPr>
+          <w:color w:val="282C34"/>
+          <w:sz w:val="21"/>
+        </w:rPr>
+        <w:t xml:space="preserve"> drops to its datasheet minimum.</w:t>
+      </w:r>
+    </w:p>
+    <w:p>
+      <w:pPr>
+        <w:spacing w:after="80"/>
+      </w:pPr>
+      <w:r>
+        <w:rPr>
+          <w:color w:val="282C34"/>
+          <w:sz w:val="21"/>
+        </w:rPr>
+        <w:t>##### Steady-State ON:</w:t>
+      </w:r>
+    </w:p>
+    <w:p>
+      <w:pPr>
+        <w:pStyle w:val="ListBullet"/>
+        <w:spacing w:after="40"/>
+        <w:ind w:left="360"/>
+      </w:pPr>
+      <w:r>
+        <w:rPr>
+          <w:color w:val="282C34"/>
+          <w:sz w:val="21"/>
+        </w:rPr>
+        <w:t xml:space="preserve">Conduction loss is purely resistive: </w:t>
+      </w:r>
+      <w:r>
+        <w:rPr>
+          <w:i/>
+          <w:color w:val="145AA0"/>
+          <w:sz w:val="21"/>
+        </w:rPr>
+        <w:t>P_{cond = I_D^2 \cdot R_{DS(on)</w:t>
+      </w:r>
+      <w:r>
+        <w:rPr>
+          <w:color w:val="282C34"/>
+          <w:sz w:val="21"/>
+        </w:rPr>
+        <w:t>.</w:t>
+      </w:r>
+    </w:p>
+    <w:p>
+      <w:pPr>
+        <w:spacing w:after="80"/>
+      </w:pPr>
+      <w:r>
+        <w:rPr>
+          <w:color w:val="282C34"/>
+          <w:sz w:val="21"/>
+        </w:rPr>
+        <w:t>##### Turn-Off Transient:</w:t>
+      </w:r>
+    </w:p>
+    <w:p>
+      <w:pPr>
+        <w:pStyle w:val="ListBullet"/>
+        <w:spacing w:after="40"/>
+        <w:ind w:left="360"/>
+      </w:pPr>
+      <w:r>
+        <w:rPr>
+          <w:b/>
+          <w:color w:val="282C34"/>
+          <w:sz w:val="21"/>
+        </w:rPr>
+        <w:t>Phase 5: Turn-Off Delay ($t_{d(off)}$) — Operating Region: LINEAR (OHMIC)</w:t>
+      </w:r>
+      <w:r>
+        <w:rPr>
+          <w:color w:val="282C34"/>
+          <w:sz w:val="21"/>
+        </w:rPr>
+        <w:t>:</w:t>
+      </w:r>
+    </w:p>
+    <w:p>
+      <w:pPr>
+        <w:pStyle w:val="ListBullet"/>
+        <w:spacing w:after="40"/>
+        <w:ind w:left="720"/>
+      </w:pPr>
+      <w:r>
+        <w:rPr>
+          <w:color w:val="282C34"/>
+          <w:sz w:val="21"/>
+        </w:rPr>
+        <w:t>Gate driver pulls gate to GND (or negative bias). Gate current flows in reverse (</w:t>
+      </w:r>
+      <w:r>
+        <w:rPr>
+          <w:i/>
+          <w:color w:val="145AA0"/>
+          <w:sz w:val="21"/>
+        </w:rPr>
+        <w:t>I_{sink</w:t>
+      </w:r>
+      <w:r>
+        <w:rPr>
+          <w:color w:val="282C34"/>
+          <w:sz w:val="21"/>
+        </w:rPr>
+        <w:t>).</w:t>
+      </w:r>
+    </w:p>
+    <w:p>
+      <w:pPr>
+        <w:pStyle w:val="ListBullet"/>
+        <w:spacing w:after="40"/>
+        <w:ind w:left="720"/>
+      </w:pPr>
+      <w:r>
+        <w:rPr>
+          <w:i/>
+          <w:color w:val="145AA0"/>
+          <w:sz w:val="21"/>
+        </w:rPr>
+        <w:t>V_{GS</w:t>
+      </w:r>
+      <w:r>
+        <w:rPr>
+          <w:color w:val="282C34"/>
+          <w:sz w:val="21"/>
+        </w:rPr>
+        <w:t xml:space="preserve"> discharges from </w:t>
+      </w:r>
+      <w:r>
+        <w:rPr>
+          <w:i/>
+          <w:color w:val="145AA0"/>
+          <w:sz w:val="21"/>
+        </w:rPr>
+        <w:t>V_{DRIVE</w:t>
+      </w:r>
+      <w:r>
+        <w:rPr>
+          <w:color w:val="282C34"/>
+          <w:sz w:val="21"/>
+        </w:rPr>
+        <w:t xml:space="preserve"> down to </w:t>
+      </w:r>
+      <w:r>
+        <w:rPr>
+          <w:i/>
+          <w:color w:val="145AA0"/>
+          <w:sz w:val="21"/>
+        </w:rPr>
+        <w:t>V_{plateau</w:t>
+      </w:r>
+      <w:r>
+        <w:rPr>
+          <w:color w:val="282C34"/>
+          <w:sz w:val="21"/>
+        </w:rPr>
+        <w:t>.</w:t>
+      </w:r>
+    </w:p>
+    <w:p>
+      <w:pPr>
+        <w:pStyle w:val="ListBullet"/>
+        <w:spacing w:after="40"/>
+        <w:ind w:left="720"/>
+      </w:pPr>
+      <w:r>
+        <w:rPr>
+          <w:i/>
+          <w:color w:val="145AA0"/>
+          <w:sz w:val="21"/>
+        </w:rPr>
+        <w:t>V_{DS</w:t>
+      </w:r>
+      <w:r>
+        <w:rPr>
+          <w:color w:val="282C34"/>
+          <w:sz w:val="21"/>
+        </w:rPr>
+        <w:t xml:space="preserve"> remains near zero. The device is still in the ohmic linear region.</w:t>
+      </w:r>
+    </w:p>
+    <w:p>
+      <w:pPr>
+        <w:pStyle w:val="ListBullet"/>
+        <w:spacing w:after="40"/>
+        <w:ind w:left="360"/>
+      </w:pPr>
+      <w:r>
+        <w:rPr>
+          <w:b/>
+          <w:color w:val="282C34"/>
+          <w:sz w:val="21"/>
+        </w:rPr>
+        <w:t>Phase 6: Voltage Rise / Turn-Off Miller Plateau ($t_{vr}$) — Operating Region: LINEAR $\rightarrow$ SATURATION</w:t>
+      </w:r>
+      <w:r>
+        <w:rPr>
+          <w:color w:val="282C34"/>
+          <w:sz w:val="21"/>
+        </w:rPr>
+        <w:t>:</w:t>
+      </w:r>
+    </w:p>
+    <w:p>
+      <w:pPr>
+        <w:pStyle w:val="ListBullet"/>
+        <w:spacing w:after="40"/>
+        <w:ind w:left="720"/>
+      </w:pPr>
+      <w:r>
+        <w:rPr>
+          <w:i/>
+          <w:color w:val="145AA0"/>
+          <w:sz w:val="21"/>
+        </w:rPr>
+        <w:t>V_{GS</w:t>
+      </w:r>
+      <w:r>
+        <w:rPr>
+          <w:color w:val="282C34"/>
+          <w:sz w:val="21"/>
+        </w:rPr>
+        <w:t xml:space="preserve"> reaches the Miller Plateau (</w:t>
+      </w:r>
+      <w:r>
+        <w:rPr>
+          <w:i/>
+          <w:color w:val="145AA0"/>
+          <w:sz w:val="21"/>
+        </w:rPr>
+        <w:t>V_{plateau</w:t>
+      </w:r>
+      <w:r>
+        <w:rPr>
+          <w:color w:val="282C34"/>
+          <w:sz w:val="21"/>
+        </w:rPr>
+        <w:t>).</w:t>
+      </w:r>
+    </w:p>
+    <w:p>
+      <w:pPr>
+        <w:pStyle w:val="ListBullet"/>
+        <w:spacing w:after="40"/>
+        <w:ind w:left="720"/>
+      </w:pPr>
+      <w:r>
+        <w:rPr>
+          <w:i/>
+          <w:color w:val="145AA0"/>
+          <w:sz w:val="21"/>
+        </w:rPr>
+        <w:t>V_{DS</w:t>
+      </w:r>
+      <w:r>
+        <w:rPr>
+          <w:color w:val="282C34"/>
+          <w:sz w:val="21"/>
+        </w:rPr>
+        <w:t xml:space="preserve"> rises rapidly from near zero up to </w:t>
+      </w:r>
+      <w:r>
+        <w:rPr>
+          <w:i/>
+          <w:color w:val="145AA0"/>
+          <w:sz w:val="21"/>
+        </w:rPr>
+        <w:t>V_{BUS + V_{spike</w:t>
+      </w:r>
+      <w:r>
+        <w:rPr>
+          <w:color w:val="282C34"/>
+          <w:sz w:val="21"/>
+        </w:rPr>
+        <w:t>.</w:t>
+      </w:r>
+    </w:p>
+    <w:p>
+      <w:pPr>
+        <w:pStyle w:val="ListBullet"/>
+        <w:spacing w:after="40"/>
+        <w:ind w:left="720"/>
+      </w:pPr>
+      <w:r>
+        <w:rPr>
+          <w:color w:val="282C34"/>
+          <w:sz w:val="21"/>
+        </w:rPr>
+        <w:t xml:space="preserve">The displacement current charging </w:t>
+      </w:r>
+      <w:r>
+        <w:rPr>
+          <w:i/>
+          <w:color w:val="145AA0"/>
+          <w:sz w:val="21"/>
+        </w:rPr>
+        <w:t>C_{gd</w:t>
+      </w:r>
+      <w:r>
+        <w:rPr>
+          <w:color w:val="282C34"/>
+          <w:sz w:val="21"/>
+        </w:rPr>
+        <w:t xml:space="preserve"> clamps </w:t>
+      </w:r>
+      <w:r>
+        <w:rPr>
+          <w:i/>
+          <w:color w:val="145AA0"/>
+          <w:sz w:val="21"/>
+        </w:rPr>
+        <w:t>V_{GS</w:t>
+      </w:r>
+      <w:r>
+        <w:rPr>
+          <w:color w:val="282C34"/>
+          <w:sz w:val="21"/>
+        </w:rPr>
+        <w:t xml:space="preserve"> at </w:t>
+      </w:r>
+      <w:r>
+        <w:rPr>
+          <w:i/>
+          <w:color w:val="145AA0"/>
+          <w:sz w:val="21"/>
+        </w:rPr>
+        <w:t>V_{plateau</w:t>
+      </w:r>
+      <w:r>
+        <w:rPr>
+          <w:color w:val="282C34"/>
+          <w:sz w:val="21"/>
+        </w:rPr>
+        <w:t>.</w:t>
+      </w:r>
+    </w:p>
+    <w:p>
+      <w:pPr>
+        <w:pStyle w:val="ListBullet"/>
+        <w:spacing w:after="40"/>
+        <w:ind w:left="720"/>
+      </w:pPr>
+      <w:r>
+        <w:rPr>
+          <w:color w:val="282C34"/>
+          <w:sz w:val="21"/>
+        </w:rPr>
+        <w:t xml:space="preserve">The device re-enters the </w:t>
+      </w:r>
+      <w:r>
+        <w:rPr>
+          <w:b/>
+          <w:color w:val="282C34"/>
+          <w:sz w:val="21"/>
+        </w:rPr>
+        <w:t>Saturation Region</w:t>
+      </w:r>
+      <w:r>
+        <w:rPr>
+          <w:color w:val="282C34"/>
+          <w:sz w:val="21"/>
+        </w:rPr>
+        <w:t>.</w:t>
+      </w:r>
+    </w:p>
+    <w:p>
+      <w:pPr>
+        <w:pStyle w:val="ListBullet"/>
+        <w:spacing w:after="40"/>
+        <w:ind w:left="360"/>
+      </w:pPr>
+      <w:r>
+        <w:rPr>
+          <w:b/>
+          <w:color w:val="282C34"/>
+          <w:sz w:val="21"/>
+        </w:rPr>
+        <w:t>Phase 7: Current Fall Time ($t_{fi}$) — Operating Region: SATURATION (ACTIVE)</w:t>
+      </w:r>
+      <w:r>
+        <w:rPr>
+          <w:color w:val="282C34"/>
+          <w:sz w:val="21"/>
+        </w:rPr>
+        <w:t>:</w:t>
+      </w:r>
+    </w:p>
+    <w:p>
+      <w:pPr>
+        <w:pStyle w:val="ListBullet"/>
+        <w:spacing w:after="40"/>
+        <w:ind w:left="720"/>
+      </w:pPr>
+      <w:r>
+        <w:rPr>
+          <w:i/>
+          <w:color w:val="145AA0"/>
+          <w:sz w:val="21"/>
+        </w:rPr>
+        <w:t>V_{DS</w:t>
+      </w:r>
+      <w:r>
+        <w:rPr>
+          <w:color w:val="282C34"/>
+          <w:sz w:val="21"/>
+        </w:rPr>
+        <w:t xml:space="preserve"> has reached </w:t>
+      </w:r>
+      <w:r>
+        <w:rPr>
+          <w:i/>
+          <w:color w:val="145AA0"/>
+          <w:sz w:val="21"/>
+        </w:rPr>
+        <w:t>V_{BUS</w:t>
+      </w:r>
+      <w:r>
+        <w:rPr>
+          <w:color w:val="282C34"/>
+          <w:sz w:val="21"/>
+        </w:rPr>
+        <w:t>, allowing the external freewheeling diode to turn ON.</w:t>
+      </w:r>
+    </w:p>
+    <w:p>
+      <w:pPr>
+        <w:pStyle w:val="ListBullet"/>
+        <w:spacing w:after="40"/>
+        <w:ind w:left="720"/>
+      </w:pPr>
+      <w:r>
+        <w:rPr>
+          <w:i/>
+          <w:color w:val="145AA0"/>
+          <w:sz w:val="21"/>
+        </w:rPr>
+        <w:t>V_{GS</w:t>
+      </w:r>
+      <w:r>
+        <w:rPr>
+          <w:color w:val="282C34"/>
+          <w:sz w:val="21"/>
+        </w:rPr>
+        <w:t xml:space="preserve"> falls from </w:t>
+      </w:r>
+      <w:r>
+        <w:rPr>
+          <w:i/>
+          <w:color w:val="145AA0"/>
+          <w:sz w:val="21"/>
+        </w:rPr>
+        <w:t>V_{plateau</w:t>
+      </w:r>
+      <w:r>
+        <w:rPr>
+          <w:color w:val="282C34"/>
+          <w:sz w:val="21"/>
+        </w:rPr>
+        <w:t xml:space="preserve"> down to </w:t>
+      </w:r>
+      <w:r>
+        <w:rPr>
+          <w:i/>
+          <w:color w:val="145AA0"/>
+          <w:sz w:val="21"/>
+        </w:rPr>
+        <w:t>V_{TH</w:t>
+      </w:r>
+      <w:r>
+        <w:rPr>
+          <w:color w:val="282C34"/>
+          <w:sz w:val="21"/>
+        </w:rPr>
+        <w:t>.</w:t>
+      </w:r>
+    </w:p>
+    <w:p>
+      <w:pPr>
+        <w:pStyle w:val="ListBullet"/>
+        <w:spacing w:after="40"/>
+        <w:ind w:left="720"/>
+      </w:pPr>
+      <w:r>
+        <w:rPr>
+          <w:i/>
+          <w:color w:val="145AA0"/>
+          <w:sz w:val="21"/>
+        </w:rPr>
+        <w:t>I_D</w:t>
+      </w:r>
+      <w:r>
+        <w:rPr>
+          <w:color w:val="282C34"/>
+          <w:sz w:val="21"/>
+        </w:rPr>
+        <w:t xml:space="preserve"> collapses from </w:t>
+      </w:r>
+      <w:r>
+        <w:rPr>
+          <w:i/>
+          <w:color w:val="145AA0"/>
+          <w:sz w:val="21"/>
+        </w:rPr>
+        <w:t>I_{LOAD</w:t>
+      </w:r>
+      <w:r>
+        <w:rPr>
+          <w:color w:val="282C34"/>
+          <w:sz w:val="21"/>
+        </w:rPr>
+        <w:t xml:space="preserve"> down to zero.</w:t>
+      </w:r>
+    </w:p>
+    <w:p>
+      <w:pPr>
+        <w:pStyle w:val="ListBullet"/>
+        <w:spacing w:after="40"/>
+        <w:ind w:left="720"/>
+      </w:pPr>
+      <w:r>
+        <w:rPr>
+          <w:color w:val="282C34"/>
+          <w:sz w:val="21"/>
+        </w:rPr>
+        <w:t xml:space="preserve">The rapid </w:t>
+      </w:r>
+      <w:r>
+        <w:rPr>
+          <w:i/>
+          <w:color w:val="145AA0"/>
+          <w:sz w:val="21"/>
+        </w:rPr>
+        <w:t>\frac{di_D{dt</w:t>
+      </w:r>
+      <w:r>
+        <w:rPr>
+          <w:color w:val="282C34"/>
+          <w:sz w:val="21"/>
+        </w:rPr>
+        <w:t xml:space="preserve"> across stray loop inductance (</w:t>
+      </w:r>
+      <w:r>
+        <w:rPr>
+          <w:i/>
+          <w:color w:val="145AA0"/>
+          <w:sz w:val="21"/>
+        </w:rPr>
+        <w:t>L_\sigma</w:t>
+      </w:r>
+      <w:r>
+        <w:rPr>
+          <w:color w:val="282C34"/>
+          <w:sz w:val="21"/>
+        </w:rPr>
+        <w:t>) generates a high inductive voltage spike:</w:t>
+      </w:r>
+    </w:p>
+    <w:p>
+      <w:pPr>
+        <w:spacing w:after="80"/>
+      </w:pPr>
+      <w:r>
+        <w:rPr>
+          <w:i/>
+          <w:color w:val="145AA0"/>
+          <w:sz w:val="21"/>
+        </w:rPr>
+      </w:r>
+      <w:r>
+        <w:rPr>
+          <w:color w:val="282C34"/>
+          <w:sz w:val="21"/>
+        </w:rPr>
+        <w:t>V_{DS(pk)} = V_{BUS} + L_\sigma \cdot \left|\frac{di_D}{dt}\right|</w:t>
+      </w:r>
+      <w:r>
+        <w:rPr>
+          <w:i/>
+          <w:color w:val="145AA0"/>
+          <w:sz w:val="21"/>
+        </w:rPr>
+      </w:r>
+    </w:p>
+    <w:p>
+      <w:pPr>
+        <w:pStyle w:val="ListBullet"/>
+        <w:spacing w:after="40"/>
+        <w:ind w:left="720"/>
+      </w:pPr>
+      <w:r>
+        <w:rPr>
+          <w:b/>
+          <w:color w:val="282C34"/>
+          <w:sz w:val="21"/>
+        </w:rPr>
+        <w:t>Peak Turn-Off Power Loss ($P_{sw(off)}$)</w:t>
+      </w:r>
+      <w:r>
+        <w:rPr>
+          <w:color w:val="282C34"/>
+          <w:sz w:val="21"/>
+        </w:rPr>
+        <w:t xml:space="preserve"> occurs here.</w:t>
+      </w:r>
+    </w:p>
+    <w:p>
+      <w:pPr>
+        <w:pStyle w:val="ListBullet"/>
+        <w:spacing w:after="40"/>
+        <w:ind w:left="360"/>
+      </w:pPr>
+      <w:r>
+        <w:rPr>
+          <w:b/>
+          <w:color w:val="282C34"/>
+          <w:sz w:val="21"/>
+        </w:rPr>
+        <w:t>Phase 8: Turn-Off Settle — Operating Region: CUTOFF</w:t>
+      </w:r>
+      <w:r>
+        <w:rPr>
+          <w:color w:val="282C34"/>
+          <w:sz w:val="21"/>
+        </w:rPr>
+        <w:t>:</w:t>
+      </w:r>
+    </w:p>
+    <w:p>
+      <w:pPr>
+        <w:pStyle w:val="ListBullet"/>
+        <w:spacing w:after="40"/>
+        <w:ind w:left="720"/>
+      </w:pPr>
+      <w:r>
+        <w:rPr>
+          <w:i/>
+          <w:color w:val="145AA0"/>
+          <w:sz w:val="21"/>
+        </w:rPr>
+        <w:t>V_{GS</w:t>
+      </w:r>
+      <w:r>
+        <w:rPr>
+          <w:color w:val="282C34"/>
+          <w:sz w:val="21"/>
+        </w:rPr>
+        <w:t xml:space="preserve"> falls below </w:t>
+      </w:r>
+      <w:r>
+        <w:rPr>
+          <w:i/>
+          <w:color w:val="145AA0"/>
+          <w:sz w:val="21"/>
+        </w:rPr>
+        <w:t>V_{TH</w:t>
+      </w:r>
+      <w:r>
+        <w:rPr>
+          <w:color w:val="282C34"/>
+          <w:sz w:val="21"/>
+        </w:rPr>
+        <w:t xml:space="preserve"> down to </w:t>
+      </w:r>
+      <w:r>
+        <w:rPr>
+          <w:i/>
+          <w:color w:val="145AA0"/>
+          <w:sz w:val="21"/>
+        </w:rPr>
+        <w:t>0\,V</w:t>
+      </w:r>
+      <w:r>
+        <w:rPr>
+          <w:color w:val="282C34"/>
+          <w:sz w:val="21"/>
+        </w:rPr>
+        <w:t xml:space="preserve"> (or negative rail).</w:t>
+      </w:r>
+    </w:p>
+    <w:p>
+      <w:pPr>
+        <w:pStyle w:val="ListBullet"/>
+        <w:spacing w:after="40"/>
+        <w:ind w:left="720"/>
+      </w:pPr>
+      <w:r>
+        <w:rPr>
+          <w:color w:val="282C34"/>
+          <w:sz w:val="21"/>
+        </w:rPr>
+        <w:t>Channel is completely closed (</w:t>
+      </w:r>
+      <w:r>
+        <w:rPr>
+          <w:i/>
+          <w:color w:val="145AA0"/>
+          <w:sz w:val="21"/>
+        </w:rPr>
+        <w:t>I_D = 0</w:t>
+      </w:r>
+      <w:r>
+        <w:rPr>
+          <w:color w:val="282C34"/>
+          <w:sz w:val="21"/>
+        </w:rPr>
+        <w:t>).</w:t>
+      </w:r>
+    </w:p>
+    <w:p>
+      <w:pPr>
+        <w:pStyle w:val="ListBullet"/>
+        <w:spacing w:after="40"/>
+        <w:ind w:left="720"/>
+      </w:pPr>
+      <w:r>
+        <w:rPr>
+          <w:color w:val="282C34"/>
+          <w:sz w:val="21"/>
+        </w:rPr>
+        <w:t xml:space="preserve">Parasitic ringing between </w:t>
+      </w:r>
+      <w:r>
+        <w:rPr>
+          <w:i/>
+          <w:color w:val="145AA0"/>
+          <w:sz w:val="21"/>
+        </w:rPr>
+        <w:t>L_\sigma</w:t>
+      </w:r>
+      <w:r>
+        <w:rPr>
+          <w:color w:val="282C34"/>
+          <w:sz w:val="21"/>
+        </w:rPr>
+        <w:t xml:space="preserve"> and </w:t>
+      </w:r>
+      <w:r>
+        <w:rPr>
+          <w:i/>
+          <w:color w:val="145AA0"/>
+          <w:sz w:val="21"/>
+        </w:rPr>
+        <w:t>C_{oss</w:t>
+      </w:r>
+      <w:r>
+        <w:rPr>
+          <w:color w:val="282C34"/>
+          <w:sz w:val="21"/>
+        </w:rPr>
+        <w:t xml:space="preserve"> dampens out to </w:t>
+      </w:r>
+      <w:r>
+        <w:rPr>
+          <w:i/>
+          <w:color w:val="145AA0"/>
+          <w:sz w:val="21"/>
+        </w:rPr>
+        <w:t>V_{BUS</w:t>
+      </w:r>
+      <w:r>
+        <w:rPr>
+          <w:color w:val="282C34"/>
+          <w:sz w:val="21"/>
+        </w:rPr>
+        <w:t>.</w:t>
+      </w:r>
+    </w:p>
+    <w:p>
+      <w:pPr>
+        <w:spacing w:before="80" w:after="80"/>
+        <w:pBdr>
+          <w:bottom w:val="single" w:sz="6" w:space="1" w:color="E2E8F0"/>
+        </w:pBdr>
+      </w:pPr>
+    </w:p>
+    <w:p>
+      <w:pPr>
+        <w:spacing w:before="160" w:after="80"/>
+      </w:pPr>
+      <w:r>
+        <w:rPr>
+          <w:b/>
+          <w:color w:val="4682B4"/>
+          <w:sz w:val="24"/>
+        </w:rPr>
+        <w:t>6.5 Soft-Switching Waveforms: Zero-Voltage Switching (ZVS)</w:t>
+      </w:r>
+    </w:p>
+    <w:p>
+      <w:pPr>
+        <w:spacing w:after="80"/>
+      </w:pPr>
+      <w:r>
+        <w:rPr>
+          <w:color w:val="282C34"/>
+          <w:sz w:val="21"/>
+        </w:rPr>
+        <w:t>In resonant topologies (LLC converters, Phase-Shifted Full-Bridge), the inductive tank current naturally discharges the output capacitance (</w:t>
+      </w:r>
+      <w:r>
+        <w:rPr>
+          <w:i/>
+          <w:color w:val="145AA0"/>
+          <w:sz w:val="21"/>
+        </w:rPr>
+        <w:t>C_{oss</w:t>
+      </w:r>
+      <w:r>
+        <w:rPr>
+          <w:color w:val="282C34"/>
+          <w:sz w:val="21"/>
+        </w:rPr>
+        <w:t xml:space="preserve">) to zero volts </w:t>
+      </w:r>
+      <w:r>
+        <w:rPr>
+          <w:b/>
+          <w:color w:val="282C34"/>
+          <w:sz w:val="21"/>
+        </w:rPr>
+        <w:t>before</w:t>
+      </w:r>
+      <w:r>
+        <w:rPr>
+          <w:color w:val="282C34"/>
+          <w:sz w:val="21"/>
+        </w:rPr>
+        <w:t xml:space="preserve"> the gate turns ON, completely eliminating hard-switching overlap:</w:t>
+      </w:r>
+    </w:p>
+    <w:tbl>
+      <w:tblPr>
+        <w:tblW w:type="auto" w:w="0"/>
+        <w:jc w:val="center"/>
+        <w:tblLook w:firstColumn="1" w:firstRow="1" w:lastColumn="0" w:lastRow="0" w:noHBand="0" w:noVBand="1" w:val="04A0"/>
+      </w:tblPr>
+      <w:tblGrid>
+        <w:gridCol w:w="9792"/>
+      </w:tblGrid>
+      <w:tr>
+        <w:tc>
+          <w:tcPr>
+            <w:tcW w:type="dxa" w:w="9792"/>
+            <w:shd w:fill="F5F6F8"/>
+            <w:tcMar>
+              <w:top w:w="80" w:type="dxa"/>
+              <w:bottom w:w="80" w:type="dxa"/>
+              <w:left w:w="140" w:type="dxa"/>
+              <w:right w:w="140" w:type="dxa"/>
+            </w:tcMar>
+            <w:tcBorders>
+              <w:left w:val="single" w:sz="18" w:space="0" w:color="CBD5E0"/>
+              <w:top w:val="none"/>
+              <w:right w:val="none"/>
+              <w:bottom w:val="none"/>
+            </w:tcBorders>
+          </w:tcPr>
+          <w:p>
+            <w:pPr>
+              <w:spacing w:line="240" w:lineRule="auto" w:after="0"/>
+            </w:pPr>
+            <w:r>
+              <w:rPr>
+                <w:rFonts w:ascii="Consolas" w:hAnsi="Consolas"/>
+                <w:color w:val="2D3748"/>
+                <w:sz w:val="18"/>
+              </w:rPr>
+              <w:t xml:space="preserve">                        Zero-Voltage Switching (ZVS) Turn-On Waveforms</w:t>
+              <w:br/>
+              <w:t xml:space="preserve">                  │◄──── Dead-Time (t_dead) ────►│</w:t>
+              <w:br/>
+              <w:t xml:space="preserve">                  │  Inductive Current Discharges│ Gate turns ON into 0V Vds</w:t>
+              <w:br/>
+              <w:t xml:space="preserve">                  │       Coss to 0V             │ (ZERO TURN-ON POWER LOSS!)</w:t>
+              <w:br/>
+              <w:t xml:space="preserve">   Vgs ^          │                              │</w:t>
+              <w:br/>
+              <w:t xml:space="preserve">       │          │                              │              V_drive</w:t>
+              <w:br/>
+              <w:t xml:space="preserve">  V_drv┼──────────┼──────────────────────────────┼──────────────.───────────</w:t>
+              <w:br/>
+              <w:t xml:space="preserve">       │          │                              │             /</w:t>
+              <w:br/>
+              <w:t xml:space="preserve">   0V  ┴──────────┴──────────────────────────────┴────────────'─────────────&gt; Time</w:t>
+              <w:br/>
+              <w:t xml:space="preserve">                  │                              │</w:t>
+              <w:br/>
+              <w:t xml:space="preserve">   Vds ^          │                              │</w:t>
+              <w:br/>
+              <w:t xml:space="preserve">       │  V_bus   │                              │</w:t>
+              <w:br/>
+              <w:t xml:space="preserve">  V_bus┼──────────┼──.                           │</w:t>
+              <w:br/>
+              <w:t xml:space="preserve">       │          │   \  Resonant dV/dt          │</w:t>
+              <w:br/>
+              <w:t xml:space="preserve">       │          │    \ (Inductive freewheeling)│</w:t>
+              <w:br/>
+              <w:t xml:space="preserve">   0V  ┴──────────┴─────'────────────────────────┴──────────────────────────&gt; Time</w:t>
+              <w:br/>
+              <w:t xml:space="preserve">                  │     ▲                        │</w:t>
+              <w:br/>
+              <w:t xml:space="preserve">                  │     └─ Vds hits 0V HERE!     │</w:t>
+              <w:br/>
+              <w:t xml:space="preserve">   Id  ^          │                              │</w:t>
+              <w:br/>
+              <w:t xml:space="preserve">       │          │                              │            +I_load (Forward)</w:t>
+              <w:br/>
+              <w:t xml:space="preserve">  +I_L ┼──────────┼──────────────────────────────┼────────────.─────────────</w:t>
+              <w:br/>
+              <w:t xml:space="preserve">   0A  ┼──────────┼──────────────────────────────┴───────────'──────────────</w:t>
+              <w:br/>
+              <w:t xml:space="preserve">       │          │     -I_mag (Freewheels       │</w:t>
+              <w:br/>
+              <w:t xml:space="preserve">  -I_L ┼──────────┴─────. through Body Diode)    │</w:t>
+              <w:br/>
+              <w:t xml:space="preserve">       │                 \                       │</w:t>
+              <w:br/>
+              <w:t xml:space="preserve">       │                  '──────────────────────┘</w:t>
+              <w:br/>
+              <w:t xml:space="preserve">                  │                              │</w:t>
+              <w:br/>
+              <w:t xml:space="preserve">  P(t) ^          │                              │</w:t>
+              <w:br/>
+              <w:t xml:space="preserve">       │          │                              │</w:t>
+              <w:br/>
+              <w:t xml:space="preserve">   0W  ┴──────────┴──────────────────────────────┴──────────────────────────&gt; Time</w:t>
+              <w:br/>
+              <w:t xml:space="preserve">                  │     Zero Vds * Id Overlap    │ P_sw(on) = 0 Watts!</w:t>
+            </w:r>
+          </w:p>
+        </w:tc>
+      </w:tr>
+    </w:tbl>
+    <w:p/>
+    <w:p>
+      <w:pPr>
+        <w:pStyle w:val="ListBullet"/>
+        <w:spacing w:after="40"/>
+        <w:ind w:left="360"/>
+      </w:pPr>
+      <w:r>
+        <w:rPr>
+          <w:color w:val="282C34"/>
+          <w:sz w:val="21"/>
+        </w:rPr>
+        <w:t xml:space="preserve">When </w:t>
+      </w:r>
+      <w:r>
+        <w:rPr>
+          <w:i/>
+          <w:color w:val="145AA0"/>
+          <w:sz w:val="21"/>
+        </w:rPr>
+        <w:t>V_{DS</w:t>
+      </w:r>
+      <w:r>
+        <w:rPr>
+          <w:color w:val="282C34"/>
+          <w:sz w:val="21"/>
+        </w:rPr>
+        <w:t xml:space="preserve"> reaches zero, the inductive current forces the body diode into forward conduction.</w:t>
+      </w:r>
+    </w:p>
+    <w:p>
+      <w:pPr>
+        <w:pStyle w:val="ListBullet"/>
+        <w:spacing w:after="40"/>
+        <w:ind w:left="360"/>
+      </w:pPr>
+      <w:r>
+        <w:rPr>
+          <w:color w:val="282C34"/>
+          <w:sz w:val="21"/>
+        </w:rPr>
+        <w:t xml:space="preserve">The gate driver then applies </w:t>
+      </w:r>
+      <w:r>
+        <w:rPr>
+          <w:i/>
+          <w:color w:val="145AA0"/>
+          <w:sz w:val="21"/>
+        </w:rPr>
+        <w:t>+V_{DRV</w:t>
+      </w:r>
+      <w:r>
+        <w:rPr>
+          <w:color w:val="282C34"/>
+          <w:sz w:val="21"/>
+        </w:rPr>
+        <w:t xml:space="preserve">. Because </w:t>
+      </w:r>
+      <w:r>
+        <w:rPr>
+          <w:i/>
+          <w:color w:val="145AA0"/>
+          <w:sz w:val="21"/>
+        </w:rPr>
+        <w:t>V_{DS = 0\,V</w:t>
+      </w:r>
+      <w:r>
+        <w:rPr>
+          <w:color w:val="282C34"/>
+          <w:sz w:val="21"/>
+        </w:rPr>
+        <w:t xml:space="preserve"> during channel turn-on, </w:t>
+      </w:r>
+      <w:r>
+        <w:rPr>
+          <w:b/>
+          <w:color w:val="282C34"/>
+          <w:sz w:val="21"/>
+        </w:rPr>
+        <w:t>turn-on switching loss is eliminated ($P_{sw(on)} = 0$)</w:t>
+      </w:r>
+      <w:r>
+        <w:rPr>
+          <w:color w:val="282C34"/>
+          <w:sz w:val="21"/>
+        </w:rPr>
+        <w:t>, and high-frequency operation (</w:t>
+      </w:r>
+      <w:r>
+        <w:rPr>
+          <w:i/>
+          <w:color w:val="145AA0"/>
+          <w:sz w:val="21"/>
+        </w:rPr>
+        <w:t>&gt; 500\,kHz</w:t>
+      </w:r>
+      <w:r>
+        <w:rPr>
+          <w:color w:val="282C34"/>
+          <w:sz w:val="21"/>
+        </w:rPr>
+        <w:t>) becomes feasible with minimal heatsinking.</w:t>
+      </w:r>
+    </w:p>
+    <w:p>
+      <w:pPr>
+        <w:spacing w:before="80" w:after="80"/>
+        <w:pBdr>
+          <w:bottom w:val="single" w:sz="6" w:space="1" w:color="E2E8F0"/>
+        </w:pBdr>
+      </w:pPr>
+    </w:p>
+    <w:p>
+      <w:pPr>
+        <w:spacing w:before="160" w:after="80"/>
+      </w:pPr>
+      <w:r>
+        <w:rPr>
+          <w:b/>
+          <w:color w:val="4682B4"/>
+          <w:sz w:val="24"/>
+        </w:rPr>
+        <w:t>6.6 Unclamped Inductive Switching (UIS) Avalanche Waveform</w:t>
+      </w:r>
+    </w:p>
+    <w:p>
+      <w:pPr>
+        <w:spacing w:after="80"/>
+      </w:pPr>
+      <w:r>
+        <w:rPr>
+          <w:color w:val="282C34"/>
+          <w:sz w:val="21"/>
+        </w:rPr>
+        <w:t>When an inductive load is disconnected without a freewheeling diode, the collapsing magnetic field forces the MOSFET into reverse avalanche breakdown:</w:t>
+      </w:r>
+    </w:p>
+    <w:tbl>
+      <w:tblPr>
+        <w:tblW w:type="auto" w:w="0"/>
+        <w:jc w:val="center"/>
+        <w:tblLook w:firstColumn="1" w:firstRow="1" w:lastColumn="0" w:lastRow="0" w:noHBand="0" w:noVBand="1" w:val="04A0"/>
+      </w:tblPr>
+      <w:tblGrid>
+        <w:gridCol w:w="9792"/>
+      </w:tblGrid>
+      <w:tr>
+        <w:tc>
+          <w:tcPr>
+            <w:tcW w:type="dxa" w:w="9792"/>
+            <w:shd w:fill="F5F6F8"/>
+            <w:tcMar>
+              <w:top w:w="80" w:type="dxa"/>
+              <w:bottom w:w="80" w:type="dxa"/>
+              <w:left w:w="140" w:type="dxa"/>
+              <w:right w:w="140" w:type="dxa"/>
+            </w:tcMar>
+            <w:tcBorders>
+              <w:left w:val="single" w:sz="18" w:space="0" w:color="CBD5E0"/>
+              <w:top w:val="none"/>
+              <w:right w:val="none"/>
+              <w:bottom w:val="none"/>
+            </w:tcBorders>
+          </w:tcPr>
+          <w:p>
+            <w:pPr>
+              <w:spacing w:line="240" w:lineRule="auto" w:after="0"/>
+            </w:pPr>
+            <w:r>
+              <w:rPr>
+                <w:rFonts w:ascii="Consolas" w:hAnsi="Consolas"/>
+                <w:color w:val="2D3748"/>
+                <w:sz w:val="18"/>
+              </w:rPr>
+              <w:t xml:space="preserve">               Unclamped Inductive Switching (UIS) Avalanche Waveform</w:t>
+              <w:br/>
+              <w:t xml:space="preserve">                 │◄── t_conduction ──►│◄─── t_avalanche (t_av) ───►│</w:t>
+              <w:br/>
+              <w:t xml:space="preserve">                 │ Inductor Charges   │ Inductor Discharges Stored  │</w:t>
+              <w:br/>
+              <w:t xml:space="preserve">                 │ to I_AS Peak       │ Magnetic Energy into Die    │</w:t>
+              <w:br/>
+              <w:t xml:space="preserve">    Vgs ^        │                    │                             │</w:t>
+              <w:br/>
+              <w:t xml:space="preserve">   V_drv┼────────┼────────────────────┐                             │</w:t>
+              <w:br/>
+              <w:t xml:space="preserve">        │        │                    │                             │</w:t>
+              <w:br/>
+              <w:t xml:space="preserve">     0V ┴────────┴────────────────────┴─────────────────────────────┴───────&gt; Time</w:t>
+              <w:br/>
+              <w:t xml:space="preserve">                 │                    │                             │</w:t>
+              <w:br/>
+              <w:t xml:space="preserve">    Vds ^        │                    │      V_BR(DSS) Breakdown    │</w:t>
+              <w:br/>
+              <w:t xml:space="preserve">   V_BR ┼────────┼────────────────────┼──────┬──────────────────────┤</w:t>
+              <w:br/>
+              <w:t xml:space="preserve">        │        │                    │      │                      │</w:t>
+              <w:br/>
+              <w:t xml:space="preserve">  V_supply ──────┼────────────────────┤      │                      ├── V_supply</w:t>
+              <w:br/>
+              <w:t xml:space="preserve">        │        │ Rds_on * Id drop   │      │                      │</w:t>
+              <w:br/>
+              <w:t xml:space="preserve">     0V ┴────────┴────────────────────┴──────┴──────────────────────┴───────&gt; Time</w:t>
+              <w:br/>
+              <w:t xml:space="preserve">                 │                    │                             │</w:t>
+              <w:br/>
+              <w:t xml:space="preserve">    Id  ^        │                    │ I_AS (Peak Avalanche)       │</w:t>
+              <w:br/>
+              <w:t xml:space="preserve">   I_AS ┼────────┼────────────────────┼─.                           │</w:t>
+              <w:br/>
+              <w:t xml:space="preserve">        │        │                    │  \                          │</w:t>
+              <w:br/>
+              <w:t xml:space="preserve">        │        │  Inductor Current  │   \  Linear Current Decay   │</w:t>
+              <w:br/>
+              <w:t xml:space="preserve">        │        │  Linear Ramp Up    │    \  di/dt = (V_BR - V_DD)/L</w:t>
+              <w:br/>
+              <w:t xml:space="preserve">        │        │  di/dt = V_DD / L  │     \                       │</w:t>
+              <w:br/>
+              <w:t xml:space="preserve">     0A ┴────────┴────────────────────┴──────'──────────────────────┴───────&gt; Time</w:t>
+              <w:br/>
+              <w:t xml:space="preserve">                 │                    │      ▲                      │</w:t>
+              <w:br/>
+              <w:t xml:space="preserve">                 │                    │      └─ Total Energy Dissipated:</w:t>
+              <w:br/>
+              <w:t xml:space="preserve">                 │                    │         E_AS = 0.5 * L * I_AS^2 * [V_BR/(V_BR - V_DD)]</w:t>
+            </w:r>
+          </w:p>
+        </w:tc>
+      </w:tr>
+    </w:tbl>
+    <w:p/>
+    <w:p>
+      <w:pPr>
+        <w:pStyle w:val="ListBullet"/>
+        <w:spacing w:after="40"/>
+        <w:ind w:left="360"/>
+      </w:pPr>
+      <w:r>
+        <w:rPr>
+          <w:color w:val="282C34"/>
+          <w:sz w:val="21"/>
+        </w:rPr>
+        <w:t xml:space="preserve">At the moment </w:t>
+      </w:r>
+      <w:r>
+        <w:rPr>
+          <w:i/>
+          <w:color w:val="145AA0"/>
+          <w:sz w:val="21"/>
+        </w:rPr>
+        <w:t>V_{GS</w:t>
+      </w:r>
+      <w:r>
+        <w:rPr>
+          <w:color w:val="282C34"/>
+          <w:sz w:val="21"/>
+        </w:rPr>
+        <w:t xml:space="preserve"> drops to </w:t>
+      </w:r>
+      <w:r>
+        <w:rPr>
+          <w:i/>
+          <w:color w:val="145AA0"/>
+          <w:sz w:val="21"/>
+        </w:rPr>
+        <w:t>0\,V</w:t>
+      </w:r>
+      <w:r>
+        <w:rPr>
+          <w:color w:val="282C34"/>
+          <w:sz w:val="21"/>
+        </w:rPr>
+        <w:t xml:space="preserve">, the inductor maintains current flow, pulling </w:t>
+      </w:r>
+      <w:r>
+        <w:rPr>
+          <w:i/>
+          <w:color w:val="145AA0"/>
+          <w:sz w:val="21"/>
+        </w:rPr>
+        <w:t>V_{DS</w:t>
+      </w:r>
+      <w:r>
+        <w:rPr>
+          <w:color w:val="282C34"/>
+          <w:sz w:val="21"/>
+        </w:rPr>
+        <w:t xml:space="preserve"> above the supply rail until the junction enters </w:t>
+      </w:r>
+      <w:r>
+        <w:rPr>
+          <w:b/>
+          <w:color w:val="282C34"/>
+          <w:sz w:val="21"/>
+        </w:rPr>
+        <w:t>Avalanche Breakdown ($V_{BR(DSS)}$)</w:t>
+      </w:r>
+      <w:r>
+        <w:rPr>
+          <w:color w:val="282C34"/>
+          <w:sz w:val="21"/>
+        </w:rPr>
+        <w:t>.</w:t>
+      </w:r>
+    </w:p>
+    <w:p>
+      <w:pPr>
+        <w:pStyle w:val="ListBullet"/>
+        <w:spacing w:after="40"/>
+        <w:ind w:left="360"/>
+      </w:pPr>
+      <w:r>
+        <w:rPr>
+          <w:color w:val="282C34"/>
+          <w:sz w:val="21"/>
+        </w:rPr>
+        <w:t xml:space="preserve">The device clamps </w:t>
+      </w:r>
+      <w:r>
+        <w:rPr>
+          <w:i/>
+          <w:color w:val="145AA0"/>
+          <w:sz w:val="21"/>
+        </w:rPr>
+        <w:t>V_{DS</w:t>
+      </w:r>
+      <w:r>
+        <w:rPr>
+          <w:color w:val="282C34"/>
+          <w:sz w:val="21"/>
+        </w:rPr>
+        <w:t xml:space="preserve"> at </w:t>
+      </w:r>
+      <w:r>
+        <w:rPr>
+          <w:i/>
+          <w:color w:val="145AA0"/>
+          <w:sz w:val="21"/>
+        </w:rPr>
+        <w:t>V_{BR(DSS)</w:t>
+      </w:r>
+      <w:r>
+        <w:rPr>
+          <w:color w:val="282C34"/>
+          <w:sz w:val="21"/>
+        </w:rPr>
+        <w:t xml:space="preserve"> while the inductor current ramps down to zero over interval </w:t>
+      </w:r>
+      <w:r>
+        <w:rPr>
+          <w:i/>
+          <w:color w:val="145AA0"/>
+          <w:sz w:val="21"/>
+        </w:rPr>
+        <w:t>t_{av</w:t>
+      </w:r>
+      <w:r>
+        <w:rPr>
+          <w:color w:val="282C34"/>
+          <w:sz w:val="21"/>
+        </w:rPr>
+        <w:t>:</w:t>
+      </w:r>
+    </w:p>
+    <w:p>
+      <w:pPr>
+        <w:spacing w:after="80"/>
+      </w:pPr>
+      <w:r>
+        <w:rPr>
+          <w:i/>
+          <w:color w:val="145AA0"/>
+          <w:sz w:val="21"/>
+        </w:rPr>
+      </w:r>
+      <w:r>
+        <w:rPr>
+          <w:color w:val="282C34"/>
+          <w:sz w:val="21"/>
+        </w:rPr>
+        <w:t>t_{av} = \frac{L \cdot I_{AS}}{V_{BR(DSS)} - V_{DD}}</w:t>
+      </w:r>
+      <w:r>
+        <w:rPr>
+          <w:i/>
+          <w:color w:val="145AA0"/>
+          <w:sz w:val="21"/>
+        </w:rPr>
+      </w:r>
+    </w:p>
+    <w:p>
+      <w:pPr>
+        <w:pStyle w:val="ListBullet"/>
+        <w:spacing w:after="40"/>
+        <w:ind w:left="360"/>
+      </w:pPr>
+      <w:r>
+        <w:rPr>
+          <w:color w:val="282C34"/>
+          <w:sz w:val="21"/>
+        </w:rPr>
+        <w:t>The entire magnetic energy (</w:t>
+      </w:r>
+      <w:r>
+        <w:rPr>
+          <w:i/>
+          <w:color w:val="145AA0"/>
+          <w:sz w:val="21"/>
+        </w:rPr>
+        <w:t>E_{AS</w:t>
+      </w:r>
+      <w:r>
+        <w:rPr>
+          <w:color w:val="282C34"/>
+          <w:sz w:val="21"/>
+        </w:rPr>
+        <w:t>) is dissipated directly as heat inside the silicon die.</w:t>
+      </w:r>
+    </w:p>
+    <w:p>
+      <w:pPr>
+        <w:spacing w:before="80" w:after="80"/>
+        <w:pBdr>
+          <w:bottom w:val="single" w:sz="6" w:space="1" w:color="E2E8F0"/>
+        </w:pBdr>
+      </w:pPr>
+    </w:p>
+    <w:p>
+      <w:pPr>
         <w:spacing w:before="240" w:after="120"/>
       </w:pPr>
       <w:r>
@@ -4307,7 +7317,750 @@
           <w:color w:val="184C78"/>
           <w:sz w:val="28"/>
         </w:rPr>
-        <w:t>7. Comparative Benchmark Matrix: Major MOSFET Types</w:t>
+        <w:t>7. Power Loss Breakdown &amp; Thermal Sizing</w:t>
+      </w:r>
+    </w:p>
+    <w:p>
+      <w:pPr>
+        <w:spacing w:after="80"/>
+      </w:pPr>
+      <w:r>
+        <w:rPr>
+          <w:color w:val="282C34"/>
+          <w:sz w:val="21"/>
+        </w:rPr>
+        <w:t>The total power dissipated by a MOSFET in a switching converter or power stage is given by:</w:t>
+      </w:r>
+    </w:p>
+    <w:p>
+      <w:pPr>
+        <w:spacing w:after="80"/>
+      </w:pPr>
+      <w:r>
+        <w:rPr>
+          <w:i/>
+          <w:color w:val="145AA0"/>
+          <w:sz w:val="21"/>
+        </w:rPr>
+      </w:r>
+      <w:r>
+        <w:rPr>
+          <w:color w:val="282C34"/>
+          <w:sz w:val="21"/>
+        </w:rPr>
+        <w:t>P_{TOTAL} = P_{COND} + P_{SW} + P_{GATE} + P_{COSS} + P_{DIODE}</w:t>
+      </w:r>
+      <w:r>
+        <w:rPr>
+          <w:i/>
+          <w:color w:val="145AA0"/>
+          <w:sz w:val="21"/>
+        </w:rPr>
+      </w:r>
+    </w:p>
+    <w:p>
+      <w:pPr>
+        <w:spacing w:before="160" w:after="80"/>
+      </w:pPr>
+      <w:r>
+        <w:rPr>
+          <w:b/>
+          <w:color w:val="4682B4"/>
+          <w:sz w:val="24"/>
+        </w:rPr>
+        <w:t>1. Conduction Loss (</w:t>
+      </w:r>
+      <w:r>
+        <w:rPr>
+          <w:b/>
+          <w:i/>
+          <w:color w:val="145AA0"/>
+          <w:sz w:val="24"/>
+        </w:rPr>
+        <w:t>P_{COND</w:t>
+      </w:r>
+      <w:r>
+        <w:rPr>
+          <w:b/>
+          <w:color w:val="4682B4"/>
+          <w:sz w:val="24"/>
+        </w:rPr>
+        <w:t>):</w:t>
+      </w:r>
+    </w:p>
+    <w:p>
+      <w:pPr>
+        <w:spacing w:after="80"/>
+      </w:pPr>
+      <w:r>
+        <w:rPr>
+          <w:i/>
+          <w:color w:val="145AA0"/>
+          <w:sz w:val="21"/>
+        </w:rPr>
+      </w:r>
+      <w:r>
+        <w:rPr>
+          <w:color w:val="282C34"/>
+          <w:sz w:val="21"/>
+        </w:rPr>
+        <w:t>P_{COND} = I_{D,rms}^2 \times R_{DS(on)}(T_j)</w:t>
+      </w:r>
+      <w:r>
+        <w:rPr>
+          <w:i/>
+          <w:color w:val="145AA0"/>
+          <w:sz w:val="21"/>
+        </w:rPr>
+      </w:r>
+    </w:p>
+    <w:p>
+      <w:pPr>
+        <w:spacing w:after="80"/>
+      </w:pPr>
+      <w:r>
+        <w:rPr>
+          <w:i/>
+          <w:color w:val="282C34"/>
+          <w:sz w:val="21"/>
+        </w:rPr>
+        <w:t>Caution</w:t>
+      </w:r>
+      <w:r>
+        <w:rPr>
+          <w:color w:val="282C34"/>
+          <w:sz w:val="21"/>
+        </w:rPr>
+        <w:t xml:space="preserve">: </w:t>
+      </w:r>
+      <w:r>
+        <w:rPr>
+          <w:i/>
+          <w:color w:val="145AA0"/>
+          <w:sz w:val="21"/>
+        </w:rPr>
+        <w:t>R_{DS(on)</w:t>
+      </w:r>
+      <w:r>
+        <w:rPr>
+          <w:color w:val="282C34"/>
+          <w:sz w:val="21"/>
+        </w:rPr>
+        <w:t xml:space="preserve"> has a strong positive temperature coefficient in Silicon (typically increasing by a factor of </w:t>
+      </w:r>
+      <w:r>
+        <w:rPr>
+          <w:i/>
+          <w:color w:val="145AA0"/>
+          <w:sz w:val="21"/>
+        </w:rPr>
+        <w:t>1.5×</w:t>
+      </w:r>
+      <w:r>
+        <w:rPr>
+          <w:color w:val="282C34"/>
+          <w:sz w:val="21"/>
+        </w:rPr>
+        <w:t xml:space="preserve"> to </w:t>
+      </w:r>
+      <w:r>
+        <w:rPr>
+          <w:i/>
+          <w:color w:val="145AA0"/>
+          <w:sz w:val="21"/>
+        </w:rPr>
+        <w:t>2.0×</w:t>
+      </w:r>
+      <w:r>
+        <w:rPr>
+          <w:color w:val="282C34"/>
+          <w:sz w:val="21"/>
+        </w:rPr>
+        <w:t xml:space="preserve"> between </w:t>
+      </w:r>
+      <w:r>
+        <w:rPr>
+          <w:i/>
+          <w:color w:val="145AA0"/>
+          <w:sz w:val="21"/>
+        </w:rPr>
+        <w:t>+25^\circC</w:t>
+      </w:r>
+      <w:r>
+        <w:rPr>
+          <w:color w:val="282C34"/>
+          <w:sz w:val="21"/>
+        </w:rPr>
+        <w:t xml:space="preserve"> and </w:t>
+      </w:r>
+      <w:r>
+        <w:rPr>
+          <w:i/>
+          <w:color w:val="145AA0"/>
+          <w:sz w:val="21"/>
+        </w:rPr>
+        <w:t>+150^\circC</w:t>
+      </w:r>
+      <w:r>
+        <w:rPr>
+          <w:color w:val="282C34"/>
+          <w:sz w:val="21"/>
+        </w:rPr>
+        <w:t>):</w:t>
+      </w:r>
+    </w:p>
+    <w:p>
+      <w:pPr>
+        <w:spacing w:after="80"/>
+      </w:pPr>
+      <w:r>
+        <w:rPr>
+          <w:i/>
+          <w:color w:val="145AA0"/>
+          <w:sz w:val="21"/>
+        </w:rPr>
+      </w:r>
+      <w:r>
+        <w:rPr>
+          <w:color w:val="282C34"/>
+          <w:sz w:val="21"/>
+        </w:rPr>
+        <w:t>R_{DS(on)}(T_j) = R_{DS(on)}(25^\circ\text{C}) \times \left(1 + \frac{\alpha}{100}(T_j - 25^\circ\text{C})\right) \quad (\alpha \approx 0.4\% \dots 0.7\% / ^\circ\text{C})</w:t>
+      </w:r>
+      <w:r>
+        <w:rPr>
+          <w:i/>
+          <w:color w:val="145AA0"/>
+          <w:sz w:val="21"/>
+        </w:rPr>
+      </w:r>
+    </w:p>
+    <w:p>
+      <w:pPr>
+        <w:spacing w:before="160" w:after="80"/>
+      </w:pPr>
+      <w:r>
+        <w:rPr>
+          <w:b/>
+          <w:color w:val="4682B4"/>
+          <w:sz w:val="24"/>
+        </w:rPr>
+        <w:t>2. Switching Losses (</w:t>
+      </w:r>
+      <w:r>
+        <w:rPr>
+          <w:b/>
+          <w:i/>
+          <w:color w:val="145AA0"/>
+          <w:sz w:val="24"/>
+        </w:rPr>
+        <w:t>P_{SW</w:t>
+      </w:r>
+      <w:r>
+        <w:rPr>
+          <w:b/>
+          <w:color w:val="4682B4"/>
+          <w:sz w:val="24"/>
+        </w:rPr>
+        <w:t>):</w:t>
+      </w:r>
+    </w:p>
+    <w:p>
+      <w:pPr>
+        <w:spacing w:after="80"/>
+      </w:pPr>
+      <w:r>
+        <w:rPr>
+          <w:color w:val="282C34"/>
+          <w:sz w:val="21"/>
+        </w:rPr>
+        <w:t xml:space="preserve">During each turn-on and turn-off transition, </w:t>
+      </w:r>
+      <w:r>
+        <w:rPr>
+          <w:i/>
+          <w:color w:val="145AA0"/>
+          <w:sz w:val="21"/>
+        </w:rPr>
+        <w:t>V_{DS</w:t>
+      </w:r>
+      <w:r>
+        <w:rPr>
+          <w:color w:val="282C34"/>
+          <w:sz w:val="21"/>
+        </w:rPr>
+        <w:t xml:space="preserve"> and </w:t>
+      </w:r>
+      <w:r>
+        <w:rPr>
+          <w:i/>
+          <w:color w:val="145AA0"/>
+          <w:sz w:val="21"/>
+        </w:rPr>
+        <w:t>I_D</w:t>
+      </w:r>
+      <w:r>
+        <w:rPr>
+          <w:color w:val="282C34"/>
+          <w:sz w:val="21"/>
+        </w:rPr>
+        <w:t xml:space="preserve"> overlap, dissipating instantaneous energy:</w:t>
+      </w:r>
+    </w:p>
+    <w:p>
+      <w:pPr>
+        <w:spacing w:after="80"/>
+      </w:pPr>
+      <w:r>
+        <w:rPr>
+          <w:i/>
+          <w:color w:val="145AA0"/>
+          <w:sz w:val="21"/>
+        </w:rPr>
+      </w:r>
+      <w:r>
+        <w:rPr>
+          <w:color w:val="282C34"/>
+          <w:sz w:val="21"/>
+        </w:rPr>
+        <w:t>P_{SW} = \frac{1}{2} V_{DS,bus} \cdot I_{D,load} \cdot (t_{rise} + t_{fall}) \cdot f_{sw}</w:t>
+      </w:r>
+      <w:r>
+        <w:rPr>
+          <w:i/>
+          <w:color w:val="145AA0"/>
+          <w:sz w:val="21"/>
+        </w:rPr>
+      </w:r>
+    </w:p>
+    <w:p>
+      <w:pPr>
+        <w:spacing w:after="80"/>
+      </w:pPr>
+      <w:r>
+        <w:rPr>
+          <w:color w:val="282C34"/>
+          <w:sz w:val="21"/>
+        </w:rPr>
+        <w:t xml:space="preserve">where </w:t>
+      </w:r>
+      <w:r>
+        <w:rPr>
+          <w:i/>
+          <w:color w:val="145AA0"/>
+          <w:sz w:val="21"/>
+        </w:rPr>
+        <w:t>t_{rise</w:t>
+      </w:r>
+      <w:r>
+        <w:rPr>
+          <w:color w:val="282C34"/>
+          <w:sz w:val="21"/>
+        </w:rPr>
+        <w:t xml:space="preserve"> and </w:t>
+      </w:r>
+      <w:r>
+        <w:rPr>
+          <w:i/>
+          <w:color w:val="145AA0"/>
+          <w:sz w:val="21"/>
+        </w:rPr>
+        <w:t>t_{fall</w:t>
+      </w:r>
+      <w:r>
+        <w:rPr>
+          <w:color w:val="282C34"/>
+          <w:sz w:val="21"/>
+        </w:rPr>
+        <w:t xml:space="preserve"> are governed by the gate driver source/sink current capability and gate charge (</w:t>
+      </w:r>
+      <w:r>
+        <w:rPr>
+          <w:i/>
+          <w:color w:val="145AA0"/>
+          <w:sz w:val="21"/>
+        </w:rPr>
+        <w:t>Q_{gs2 + Q_{gd</w:t>
+      </w:r>
+      <w:r>
+        <w:rPr>
+          <w:color w:val="282C34"/>
+          <w:sz w:val="21"/>
+        </w:rPr>
+        <w:t>).</w:t>
+      </w:r>
+    </w:p>
+    <w:p>
+      <w:pPr>
+        <w:spacing w:before="160" w:after="80"/>
+      </w:pPr>
+      <w:r>
+        <w:rPr>
+          <w:b/>
+          <w:color w:val="4682B4"/>
+          <w:sz w:val="24"/>
+        </w:rPr>
+        <w:t>3. Gate Drive Power Loss (</w:t>
+      </w:r>
+      <w:r>
+        <w:rPr>
+          <w:b/>
+          <w:i/>
+          <w:color w:val="145AA0"/>
+          <w:sz w:val="24"/>
+        </w:rPr>
+        <w:t>P_{GATE</w:t>
+      </w:r>
+      <w:r>
+        <w:rPr>
+          <w:b/>
+          <w:color w:val="4682B4"/>
+          <w:sz w:val="24"/>
+        </w:rPr>
+        <w:t>):</w:t>
+      </w:r>
+    </w:p>
+    <w:p>
+      <w:pPr>
+        <w:spacing w:after="80"/>
+      </w:pPr>
+      <w:r>
+        <w:rPr>
+          <w:color w:val="282C34"/>
+          <w:sz w:val="21"/>
+        </w:rPr>
+        <w:t>Power delivered by the gate driver supply rail to charge and discharge the input capacitance:</w:t>
+      </w:r>
+    </w:p>
+    <w:p>
+      <w:pPr>
+        <w:spacing w:after="80"/>
+      </w:pPr>
+      <w:r>
+        <w:rPr>
+          <w:i/>
+          <w:color w:val="145AA0"/>
+          <w:sz w:val="21"/>
+        </w:rPr>
+      </w:r>
+      <w:r>
+        <w:rPr>
+          <w:color w:val="282C34"/>
+          <w:sz w:val="21"/>
+        </w:rPr>
+        <w:t>P_{GATE} = Q_g \times V_{GS,drive} \times f_{sw}</w:t>
+      </w:r>
+      <w:r>
+        <w:rPr>
+          <w:i/>
+          <w:color w:val="145AA0"/>
+          <w:sz w:val="21"/>
+        </w:rPr>
+      </w:r>
+    </w:p>
+    <w:p>
+      <w:pPr>
+        <w:spacing w:after="80"/>
+      </w:pPr>
+      <w:r>
+        <w:rPr>
+          <w:i/>
+          <w:color w:val="282C34"/>
+          <w:sz w:val="21"/>
+        </w:rPr>
+        <w:t>(Note: Most of this loss is dissipated inside the gate resistor $R_G$ and gate driver output stage).</w:t>
+      </w:r>
+    </w:p>
+    <w:p>
+      <w:pPr>
+        <w:spacing w:before="160" w:after="80"/>
+      </w:pPr>
+      <w:r>
+        <w:rPr>
+          <w:b/>
+          <w:color w:val="4682B4"/>
+          <w:sz w:val="24"/>
+        </w:rPr>
+        <w:t>4. Output Capacitive Stored Energy Loss (</w:t>
+      </w:r>
+      <w:r>
+        <w:rPr>
+          <w:b/>
+          <w:i/>
+          <w:color w:val="145AA0"/>
+          <w:sz w:val="24"/>
+        </w:rPr>
+        <w:t>P_{COSS</w:t>
+      </w:r>
+      <w:r>
+        <w:rPr>
+          <w:b/>
+          <w:color w:val="4682B4"/>
+          <w:sz w:val="24"/>
+        </w:rPr>
+        <w:t>):</w:t>
+      </w:r>
+    </w:p>
+    <w:p>
+      <w:pPr>
+        <w:spacing w:after="80"/>
+      </w:pPr>
+      <w:r>
+        <w:rPr>
+          <w:color w:val="282C34"/>
+          <w:sz w:val="21"/>
+        </w:rPr>
+        <w:t xml:space="preserve">During hard-switching turn-on, the energy stored in </w:t>
+      </w:r>
+      <w:r>
+        <w:rPr>
+          <w:i/>
+          <w:color w:val="145AA0"/>
+          <w:sz w:val="21"/>
+        </w:rPr>
+        <w:t>C_{oss</w:t>
+      </w:r>
+      <w:r>
+        <w:rPr>
+          <w:color w:val="282C34"/>
+          <w:sz w:val="21"/>
+        </w:rPr>
+        <w:t xml:space="preserve"> is dissipated directly into the MOSFET channel:</w:t>
+      </w:r>
+    </w:p>
+    <w:p>
+      <w:pPr>
+        <w:spacing w:after="80"/>
+      </w:pPr>
+      <w:r>
+        <w:rPr>
+          <w:i/>
+          <w:color w:val="145AA0"/>
+          <w:sz w:val="21"/>
+        </w:rPr>
+      </w:r>
+      <w:r>
+        <w:rPr>
+          <w:color w:val="282C34"/>
+          <w:sz w:val="21"/>
+        </w:rPr>
+        <w:t>P_{COSS} = \frac{1}{2} C_{oss(er)} \cdot V_{DS}^2 \cdot f_{sw} = f_{sw} \int_0^{V_{DS}} v \cdot C_{oss}(v) \, dv</w:t>
+      </w:r>
+      <w:r>
+        <w:rPr>
+          <w:i/>
+          <w:color w:val="145AA0"/>
+          <w:sz w:val="21"/>
+        </w:rPr>
+      </w:r>
+    </w:p>
+    <w:p>
+      <w:pPr>
+        <w:spacing w:before="160" w:after="80"/>
+      </w:pPr>
+      <w:r>
+        <w:rPr>
+          <w:b/>
+          <w:color w:val="4682B4"/>
+          <w:sz w:val="24"/>
+        </w:rPr>
+        <w:t>5. Body Diode Conduction &amp; Reverse Recovery Loss (</w:t>
+      </w:r>
+      <w:r>
+        <w:rPr>
+          <w:b/>
+          <w:i/>
+          <w:color w:val="145AA0"/>
+          <w:sz w:val="24"/>
+        </w:rPr>
+        <w:t>P_{DIODE</w:t>
+      </w:r>
+      <w:r>
+        <w:rPr>
+          <w:b/>
+          <w:color w:val="4682B4"/>
+          <w:sz w:val="24"/>
+        </w:rPr>
+        <w:t>):</w:t>
+      </w:r>
+    </w:p>
+    <w:p>
+      <w:pPr>
+        <w:spacing w:after="80"/>
+      </w:pPr>
+      <w:r>
+        <w:rPr>
+          <w:color w:val="282C34"/>
+          <w:sz w:val="21"/>
+        </w:rPr>
+        <w:t>In half-bridge and synchronous converters during dead-time:</w:t>
+      </w:r>
+    </w:p>
+    <w:p>
+      <w:pPr>
+        <w:spacing w:after="80"/>
+      </w:pPr>
+      <w:r>
+        <w:rPr>
+          <w:i/>
+          <w:color w:val="145AA0"/>
+          <w:sz w:val="21"/>
+        </w:rPr>
+      </w:r>
+      <w:r>
+        <w:rPr>
+          <w:color w:val="282C34"/>
+          <w:sz w:val="21"/>
+        </w:rPr>
+        <w:t>P_{DIODE} = (V_{SD} \cdot I_{LOAD} \cdot t_{dead} \cdot f_{sw}) + (Q_{rr} \cdot V_{DS,bus} \cdot f_{sw})</w:t>
+      </w:r>
+      <w:r>
+        <w:rPr>
+          <w:i/>
+          <w:color w:val="145AA0"/>
+          <w:sz w:val="21"/>
+        </w:rPr>
+      </w:r>
+    </w:p>
+    <w:p>
+      <w:pPr>
+        <w:spacing w:before="160" w:after="80"/>
+      </w:pPr>
+      <w:r>
+        <w:rPr>
+          <w:b/>
+          <w:color w:val="4682B4"/>
+          <w:sz w:val="24"/>
+        </w:rPr>
+        <w:t>6. Thermal Network Junction Temperature Calculation:</w:t>
+      </w:r>
+    </w:p>
+    <w:p>
+      <w:pPr>
+        <w:spacing w:after="80"/>
+      </w:pPr>
+      <w:r>
+        <w:rPr>
+          <w:i/>
+          <w:color w:val="145AA0"/>
+          <w:sz w:val="21"/>
+        </w:rPr>
+      </w:r>
+      <w:r>
+        <w:rPr>
+          <w:color w:val="282C34"/>
+          <w:sz w:val="21"/>
+        </w:rPr>
+        <w:t>T_j = T_A + P_{TOTAL} \cdot (R_{\theta JC} + R_{\theta CS} + R_{\theta SA})</w:t>
+      </w:r>
+      <w:r>
+        <w:rPr>
+          <w:i/>
+          <w:color w:val="145AA0"/>
+          <w:sz w:val="21"/>
+        </w:rPr>
+      </w:r>
+    </w:p>
+    <w:p>
+      <w:pPr>
+        <w:pStyle w:val="ListBullet"/>
+        <w:spacing w:after="40"/>
+        <w:ind w:left="360"/>
+      </w:pPr>
+      <w:r>
+        <w:rPr>
+          <w:i/>
+          <w:color w:val="145AA0"/>
+          <w:sz w:val="21"/>
+        </w:rPr>
+        <w:t>R_{\theta JC</w:t>
+      </w:r>
+      <w:r>
+        <w:rPr>
+          <w:color w:val="282C34"/>
+          <w:sz w:val="21"/>
+        </w:rPr>
+        <w:t>: Junction-to-case thermal resistance (</w:t>
+      </w:r>
+      <w:r>
+        <w:rPr>
+          <w:i/>
+          <w:color w:val="145AA0"/>
+          <w:sz w:val="21"/>
+        </w:rPr>
+        <w:t>^\circC/W</w:t>
+      </w:r>
+      <w:r>
+        <w:rPr>
+          <w:color w:val="282C34"/>
+          <w:sz w:val="21"/>
+        </w:rPr>
+        <w:t>, from datasheet)</w:t>
+      </w:r>
+    </w:p>
+    <w:p>
+      <w:pPr>
+        <w:pStyle w:val="ListBullet"/>
+        <w:spacing w:after="40"/>
+        <w:ind w:left="360"/>
+      </w:pPr>
+      <w:r>
+        <w:rPr>
+          <w:i/>
+          <w:color w:val="145AA0"/>
+          <w:sz w:val="21"/>
+        </w:rPr>
+        <w:t>R_{\theta CS</w:t>
+      </w:r>
+      <w:r>
+        <w:rPr>
+          <w:color w:val="282C34"/>
+          <w:sz w:val="21"/>
+        </w:rPr>
+        <w:t>: Case-to-heatsink thermal interface resistance (thermal paste/sil-pad)</w:t>
+      </w:r>
+    </w:p>
+    <w:p>
+      <w:pPr>
+        <w:pStyle w:val="ListBullet"/>
+        <w:spacing w:after="40"/>
+        <w:ind w:left="360"/>
+      </w:pPr>
+      <w:r>
+        <w:rPr>
+          <w:i/>
+          <w:color w:val="145AA0"/>
+          <w:sz w:val="21"/>
+        </w:rPr>
+        <w:t>R_{\theta SA</w:t>
+      </w:r>
+      <w:r>
+        <w:rPr>
+          <w:color w:val="282C34"/>
+          <w:sz w:val="21"/>
+        </w:rPr>
+        <w:t>: Heatsink-to-ambient thermal resistance</w:t>
+      </w:r>
+    </w:p>
+    <w:p>
+      <w:pPr>
+        <w:spacing w:before="80" w:after="80"/>
+        <w:pBdr>
+          <w:bottom w:val="single" w:sz="6" w:space="1" w:color="E2E8F0"/>
+        </w:pBdr>
+      </w:pPr>
+    </w:p>
+    <w:p>
+      <w:pPr>
+        <w:spacing w:before="240" w:after="120"/>
+      </w:pPr>
+      <w:r>
+        <w:rPr>
+          <w:b/>
+          <w:color w:val="184C78"/>
+          <w:sz w:val="28"/>
+        </w:rPr>
+        <w:t>8. Comparative Benchmark Matrix: Major MOSFET Types</w:t>
       </w:r>
     </w:p>
     <w:tbl>
@@ -5787,7 +9540,7 @@
                 <w:color w:val="282C34"/>
                 <w:sz w:val="18"/>
               </w:rPr>
-              <w:t>$175^\circ\text{C} \dots 200^\circ\text{C}$</w:t>
+              <w:t>$175^\circ\text{C} \dots 200^\circ\text{C}+$</w:t>
             </w:r>
           </w:p>
         </w:tc>
@@ -6231,7 +9984,7 @@
           <w:color w:val="184C78"/>
           <w:sz w:val="28"/>
         </w:rPr>
-        <w:t>8. Power Electronics Applications: Converters, Gate Drivers &amp; Protection</w:t>
+        <w:t>9. Power Electronics Applications: Converters, Gate Drivers &amp; Protection</w:t>
       </w:r>
     </w:p>
     <w:p>
@@ -6863,7 +10616,7 @@
           <w:color w:val="184C78"/>
           <w:sz w:val="28"/>
         </w:rPr>
-        <w:t xml:space="preserve">9. CLI Engineering Tool: </w:t>
+        <w:t xml:space="preserve">10. CLI Engineering Tool: </w:t>
       </w:r>
       <w:r>
         <w:rPr>

</xml_diff>